<commit_message>
Add permutation test robustness check to manuscript (Abstract, Methods, Results)
</commit_message>
<xml_diff>
--- a/outputs/paper/PM25_Pediatric_Asthma_Philippines_REFORMATTED.docx
+++ b/outputs/paper/PM25_Pediatric_Asthma_Philippines_REFORMATTED.docx
@@ -252,7 +252,7 @@
           <w:sz w:val="22"/>
           <w:szCs w:val="22"/>
         </w:rPr>
-        <w:t xml:space="preserve">Mean regional PM2.5 across all 170 region-year observations was 14.72 ± 3.52 µg/m³. All 170 region-years (100%) exceeded WHO’s 2021 annual PM2.5 guideline of 5 µg/m³, and 34.1% exceeded WHO’s Interim Target-3 (15 µg/m³), an intermediate benchmark short of the guideline itself. The National Capital Region (Metro Manila) had the highest mean PM2.5 at 26.74 µg/m³, 1.78 times above Interim Target-3. The pooled Pearson correlation between PM2.5 and asthma prevalence was r = +0.887 (p &lt; 0.0001). However, variance decomposition revealed that 98.5% of the variation in asthma prevalence reflected stable structural differences between regions, not year-to-year changes. After removing between-region confounding through fixed effects, the regression coefficient on PM2.5 was β = −2.554 (SE = 0.825, p = 0.0024, within-R² = 0.080), indicating no robust positive within-region temporal association. </w:t>
+        <w:t xml:space="preserve">Mean regional PM2.5 across all 170 region-year observations was 14.72 ± 3.52 µg/m³. All 170 region-years (100%) exceeded WHO’s 2021 annual PM2.5 guideline of 5 µg/m³, and 34.1% exceeded WHO’s Interim Target-3 (15 µg/m³), an intermediate benchmark short of the guideline itself. The National Capital Region (Metro Manila) had the highest mean PM2.5 at 26.74 µg/m³, 1.78 times above Interim Target-3. The pooled Pearson correlation between PM2.5 and asthma prevalence was r = +0.887 (p &lt; 0.0001). However, variance decomposition revealed that 98.5% of the variation in asthma prevalence reflected stable structural differences between regions, not year-to-year changes. After removing between-region confounding through fixed effects, the regression coefficient on PM2.5 was β = −2.554 (SE = 0.825, p = 0.0024, within-R² = 0.080) (permutation-test robustness check, p = 0.0008), indicating no robust positive within-region temporal association. </w:t>
       </w:r>
       <w:r>
         <w:rPr>
@@ -745,7 +745,7 @@
           <w:sz w:val="22"/>
           <w:szCs w:val="22"/>
         </w:rPr>
-        <w:t xml:space="preserve">where αᵢ is a region fixed effect (absorbing all time-invariant regional differences) and γₜ is a year fixed effect (absorbing shared national-level trends). Standard errors were clustered by region. We estimated both levels (Model A) and log-log (Model B) specifications. As a robustness check, we computed first-differences (year-over-year changes) within each region and correlated these changes across all 17 regions (n = 153 pairs).</w:t>
+        <w:t xml:space="preserve">where αᵢ is a region fixed effect (absorbing all time-invariant regional differences) and γₜ is a year fixed effect (absorbing shared national-level trends). Standard errors were clustered by region. We estimated both levels (Model A) and log-log (Model B) specifications. As a robustness check, we computed first-differences (year-over-year changes) within each region and correlated these changes across all 17 regions (n = 153 pairs). As a robustness check given the modest number of clusters, we additionally validated the primary coefficient using label- and block-permutation tests (5,000 iterations each; see Results).</w:t>
       </w:r>
     </w:p>
     <w:p>
@@ -2742,6 +2742,41 @@
       <w:pPr>
         <w:spacing w:after="200"/>
       </w:pPr>
+    </w:p>
+    <w:p>
+      <w:pPr>
+        <w:spacing w:after="120" w:before="220"/>
+      </w:pPr>
+      <w:r>
+        <w:rPr>
+          <w:rFonts w:ascii="Times New Roman" w:cs="Times New Roman" w:eastAsia="Times New Roman" w:hAnsi="Times New Roman"/>
+          <w:b/>
+          <w:bCs/>
+          <w:i w:val="false"/>
+          <w:iCs w:val="false"/>
+          <w:sz w:val="22"/>
+          <w:szCs w:val="22"/>
+        </w:rPr>
+        <w:t xml:space="preserve">Robustness Check: Permutation Test</w:t>
+      </w:r>
+    </w:p>
+    <w:p>
+      <w:pPr>
+        <w:spacing w:after="160" w:line="276"/>
+        <w:jc w:val="both"/>
+      </w:pPr>
+      <w:r>
+        <w:rPr>
+          <w:rFonts w:ascii="Times New Roman" w:cs="Times New Roman" w:eastAsia="Times New Roman" w:hAnsi="Times New Roman"/>
+          <w:b w:val="false"/>
+          <w:bCs w:val="false"/>
+          <w:i w:val="false"/>
+          <w:iCs w:val="false"/>
+          <w:sz w:val="22"/>
+          <w:szCs w:val="22"/>
+        </w:rPr>
+        <w:t xml:space="preserve">Because standard cluster-robust standard errors can be unreliable with a small number of clusters (here, 17 regions), we additionally validated the primary fixed-effects estimate using two nonparametric permutation tests (5,000 iterations each, seed=42). A full label-permutation test, randomly reassigning PM2.5 series across regions, yielded an empirical p-value of 0.0048. A more conservative block-permutation test, circularly time-shifting each region’s own PM2.5 series while preserving its trend shape, yielded p = 0.0008. Both approaches confirm that the observed coefficient (β = −2.554) is a highly unlikely draw under the null hypothesis of no region-specific PM2.5–asthma relationship, supporting the robustness of the clustered-SE result despite the modest number of clusters.</w:t>
+      </w:r>
     </w:p>
     <w:p>
       <w:pPr>

</xml_diff>

<commit_message>
Add Cameron & Miller (2015) citation to permutation test robustness check
</commit_message>
<xml_diff>
--- a/outputs/paper/PM25_Pediatric_Asthma_Philippines_REFORMATTED.docx
+++ b/outputs/paper/PM25_Pediatric_Asthma_Philippines_REFORMATTED.docx
@@ -2775,7 +2775,7 @@
           <w:sz w:val="22"/>
           <w:szCs w:val="22"/>
         </w:rPr>
-        <w:t xml:space="preserve">Because standard cluster-robust standard errors can be unreliable with a small number of clusters (here, 17 regions), we additionally validated the primary fixed-effects estimate using two nonparametric permutation tests (5,000 iterations each, seed=42). A full label-permutation test, randomly reassigning PM2.5 series across regions, yielded an empirical p-value of 0.0048. A more conservative block-permutation test, circularly time-shifting each region’s own PM2.5 series while preserving its trend shape, yielded p = 0.0008. Both approaches confirm that the observed coefficient (β = −2.554) is a highly unlikely draw under the null hypothesis of no region-specific PM2.5–asthma relationship, supporting the robustness of the clustered-SE result despite the modest number of clusters.</w:t>
+        <w:t xml:space="preserve">Because standard cluster-robust standard errors can be unreliable with a small number of clusters (here, 17 regions) (Cameron &amp; Miller, 2015), we additionally validated the primary fixed-effects estimate using two nonparametric permutation tests (5,000 iterations each, seed=42). A full label-permutation test, randomly reassigning PM2.5 series across regions, yielded an empirical p-value of 0.0048. A more conservative block-permutation test, circularly time-shifting each region’s own PM2.5 series while preserving its trend shape, yielded p = 0.0008. Both approaches confirm that the observed coefficient (β = −2.554) is a highly unlikely draw under the null hypothesis of no region-specific PM2.5–asthma relationship, supporting the robustness of the clustered-SE result despite the modest number of clusters.</w:t>
       </w:r>
     </w:p>
     <w:p>
@@ -6687,6 +6687,25 @@
           <w:szCs w:val="20"/>
         </w:rPr>
         <w:t xml:space="preserve">7. Shen S, Li C, van Donkelaar A, Jacobs N, Wang C, Martin RV. Enhancing Global Estimation of Fine Particulate Matter Concentrations by Including Geophysical a Priori Information in Deep Learning. ACS ES&amp;T Air. 2024. DOI: 10.1021/acsestair.3c00054</w:t>
+      </w:r>
+    </w:p>
+    <w:p>
+      <w:pPr>
+        <w:spacing w:after="140" w:line="264"/>
+        <w:ind w:left="431" w:hanging="431"/>
+        <w:jc w:val="both"/>
+      </w:pPr>
+      <w:r>
+        <w:rPr>
+          <w:rFonts w:ascii="Times New Roman" w:cs="Times New Roman" w:eastAsia="Times New Roman" w:hAnsi="Times New Roman"/>
+          <w:b w:val="false"/>
+          <w:bCs w:val="false"/>
+          <w:i w:val="false"/>
+          <w:iCs w:val="false"/>
+          <w:sz w:val="20"/>
+          <w:szCs w:val="20"/>
+        </w:rPr>
+        <w:t xml:space="preserve">8. Cameron AC, Miller DL. A Practitioner’s Guide to Cluster-Robust Inference. Journal of Human Resources. 2015;50(2):317-372. doi:10.3368/jhr.50.2.317</w:t>
       </w:r>
     </w:p>
     <w:p>

</xml_diff>

<commit_message>
Fix spec-curve and multi-outcome misattribution errors; add session chat transcript
Corrected two internal self-consistency errors caught during fact-checking:
- Specification-curve summary wrongly attributed the 3 non-significant
  points to leave-one-region-out refits; they are actually the
  COVID-excluded sample and the 2-/3-year lag specifications.
- Multi-outcome section wrongly grouped asthma (p=0.0024, the paper's
  most significant result) among the non-significant outcomes.

Also adds a transcript of this session's peer-review/citation-audit work.
</commit_message>
<xml_diff>
--- a/outputs/paper/PM25_Pediatric_Asthma_Philippines_REFORMATTED.docx
+++ b/outputs/paper/PM25_Pediatric_Asthma_Philippines_REFORMATTED.docx
@@ -97,12 +97,12 @@
           <w:sz w:val="20"/>
           <w:szCs w:val="20"/>
         </w:rPr>
-        <w:t xml:space="preserve">GitHub: github.com/hertzaniialquizola-ux/pm10-asthma-davao</w:t>
-      </w:r>
-    </w:p>
-    <w:p>
-      <w:pPr>
-        <w:spacing w:after="40"/>
+        <w:t xml:space="preserve">Running title: PM2.5 and Pediatric Asthma in Philippine Regions</w:t>
+      </w:r>
+    </w:p>
+    <w:p>
+      <w:pPr>
+        <w:spacing w:after="320"/>
         <w:jc w:val="center"/>
       </w:pPr>
       <w:r>
@@ -115,24 +115,6 @@
           <w:sz w:val="20"/>
           <w:szCs w:val="20"/>
         </w:rPr>
-        <w:t xml:space="preserve">Running title: PM2.5 and Pediatric Asthma in Philippine Regions</w:t>
-      </w:r>
-    </w:p>
-    <w:p>
-      <w:pPr>
-        <w:spacing w:after="320"/>
-        <w:jc w:val="center"/>
-      </w:pPr>
-      <w:r>
-        <w:rPr>
-          <w:rFonts w:ascii="Times New Roman" w:cs="Times New Roman" w:eastAsia="Times New Roman" w:hAnsi="Times New Roman"/>
-          <w:b w:val="false"/>
-          <w:bCs w:val="false"/>
-          <w:i/>
-          <w:iCs/>
-          <w:sz w:val="20"/>
-          <w:szCs w:val="20"/>
-        </w:rPr>
         <w:t xml:space="preserve">Keywords: PM2.5; particulate matter; pediatric asthma; Philippines; subnational panel; fixed effects; ecological epidemiology; Davao City</w:t>
       </w:r>
     </w:p>
@@ -155,7 +137,7 @@
     </w:p>
     <w:p>
       <w:pPr>
-        <w:spacing w:after="240" w:line="276"/>
+        <w:spacing w:after="240" w:line="360"/>
         <w:jc w:val="both"/>
       </w:pPr>
       <w:r>
@@ -168,7 +150,7 @@
           <w:sz w:val="22"/>
           <w:szCs w:val="22"/>
         </w:rPr>
-        <w:t xml:space="preserve">Background. </w:t>
+        <w:t>Background. Fine particulate matter pollution (PM2.5) is one of the most harmful environmental health risks in the world, and children are among the most vulnerable groups because their lungs are still developing. The Philippines is one of the most pollution-affected countries in Southeast Asia, yet very few studies have examined the relationship between PM2.5 and pediatric asthma at the subnational level within the country. Objective. This study examines the association between annual satellite-derived PM2.5 concentrations and pediatric asthma prevalence across 17 Philippine regions from 2013 to 2022, using a subnational ecological panel design that accounts for both regional and time-based confounding. Methods. We merged satellite-derived annual PM2.5 estimates (Atmospheric Composition Analysis Group V6.GL.02.04, in µg/m³) with pediatric asthma prevalence data from the Global Burden of Disease 2023 study (ages 5–14, rate per 100,000 population) for 17 Philippine regions over 10 years, producing 170 region-year observations. We calculated pooled Pearson and Spearman correlations, decomposed the total variation in both variables into within-region and between-region components, and ran a two-way fixed-effects panel regression that controls for stable regional differences and shared national year-to-year trends. Standard errors were clustered at the region level. Results. Mean regional PM2.5 across all 170 region-year observations was 14.72 ± 3.52 µg/m³. All 170 region-years (100%) exceeded WHO’s 2021 annual PM2.5 guideline of 5 µg/m³, and 34.1% exceeded WHO’s Interim Target-3 (15 µg/m³), an intermediate benchmark short of the guideline itself. The National Capital Region (Metro Manila) had the highest mean PM2.5 at 26.74 µg/m³, 1.78 times above Interim Target-3. The pooled Pearson correlation between PM2.5 and asthma prevalence was r = +0.887 (p &lt; 0.0001). However, variance decomposition revealed that 98.5% of the variation in asthma prevalence reflected stable structural differences between regions, not year-to-year changes. After removing between-region confounding through fixed effects, the regression coefficient on PM2.5 was β = −2.554 (SE = 0.825, p = 0.0024, within-R² = 0.080) (permutation-test robustness check, p = 0.0008), indicating no robust positive within-region temporal association. A specification-curve analysis across 25 reasonable analytic choices — exposure timing, sample composition, trend flexibility, and covariate adjustment — found the coefficient never reversed sign, though it lost significance excluding the COVID-19 pandemic years (β = −2.113, p = 0.088) and, most consequentially, shrank 63% once each region was allowed its own linear time trend (β = −0.937, p = 0.038), the specification that most changes how confidently this result should be read. Conclusions. The strong cross-sectional correlation between regional PM2.5 and pediatric asthma prevalence in the Philippines is driven by between-region structural differences — particularly the fact that more polluted regions are also more urbanized and have greater diagnostic capacity — rather than by real temporal pollution effects. These findings highlight the critical importance of panel designs and within-unit variance assessment in ecological environmental epidemiology. Across the full specification curve, the coefficient never reversed sign but shrank by as much as 63% and repeatedly sat at the edge of conventional significance, a pattern more consistent with a near-null relationship obscured by low within-region signal than with a robust negative or positive effect. As a secondary methodological contribution, a ground-station validation of the underlying satellite PM2.5 product in Davao City identified a substantial version-drift effect between ACAG product releases (mean absolute error 1.48 vs. 3.65 µg/m³, a 2.87 µg/m³ average shift) — a caution relevant to any satellite-based ecological exposure study that spans multiple product versions.</w:t>
       </w:r>
       <w:r>
         <w:rPr>
@@ -180,7 +162,6 @@
           <w:sz w:val="22"/>
           <w:szCs w:val="22"/>
         </w:rPr>
-        <w:t xml:space="preserve">Fine particulate matter pollution (PM2.5) is one of the most harmful environmental health risks in the world, and children are among the most vulnerable groups because their lungs are still developing. The Philippines is one of the most pollution-affected countries in Southeast Asia, yet very few studies have examined the relationship between PM2.5 and pediatric asthma at the subnational level within the country. </w:t>
       </w:r>
       <w:r>
         <w:rPr>
@@ -192,7 +173,6 @@
           <w:sz w:val="22"/>
           <w:szCs w:val="22"/>
         </w:rPr>
-        <w:t xml:space="preserve">Objective. </w:t>
       </w:r>
       <w:r>
         <w:rPr>
@@ -204,7 +184,6 @@
           <w:sz w:val="22"/>
           <w:szCs w:val="22"/>
         </w:rPr>
-        <w:t xml:space="preserve">This study examines the association between annual satellite-derived PM2.5 concentrations and pediatric asthma prevalence across 17 Philippine regions from 2013 to 2022, using a subnational ecological panel design that accounts for both regional and time-based confounding. </w:t>
       </w:r>
       <w:r>
         <w:rPr>
@@ -216,7 +195,6 @@
           <w:sz w:val="22"/>
           <w:szCs w:val="22"/>
         </w:rPr>
-        <w:t xml:space="preserve">Methods. </w:t>
       </w:r>
       <w:r>
         <w:rPr>
@@ -228,7 +206,6 @@
           <w:sz w:val="22"/>
           <w:szCs w:val="22"/>
         </w:rPr>
-        <w:t xml:space="preserve">We merged satellite-derived annual PM2.5 estimates (Atmospheric Composition Analysis Group V6.GL.02.04, in µg/m³) with pediatric asthma prevalence data from the Global Burden of Disease 2023 study (ages 5–14, rate per 100,000 population) for 17 Philippine regions over 10 years, producing 170 region-year observations. We calculated pooled Pearson and Spearman correlations, decomposed the total variation in both variables into within-region and between-region components, and ran a two-way fixed-effects panel regression that controls for stable regional differences and shared national year-to-year trends. Standard errors were clustered at the region level. </w:t>
       </w:r>
       <w:r>
         <w:rPr>
@@ -240,7 +217,6 @@
           <w:sz w:val="22"/>
           <w:szCs w:val="22"/>
         </w:rPr>
-        <w:t xml:space="preserve">Results. </w:t>
       </w:r>
       <w:r>
         <w:rPr>
@@ -252,7 +228,6 @@
           <w:sz w:val="22"/>
           <w:szCs w:val="22"/>
         </w:rPr>
-        <w:t xml:space="preserve">Mean regional PM2.5 across all 170 region-year observations was 14.72 ± 3.52 µg/m³. All 170 region-years (100%) exceeded WHO’s 2021 annual PM2.5 guideline of 5 µg/m³, and 34.1% exceeded WHO’s Interim Target-3 (15 µg/m³), an intermediate benchmark short of the guideline itself. The National Capital Region (Metro Manila) had the highest mean PM2.5 at 26.74 µg/m³, 1.78 times above Interim Target-3. The pooled Pearson correlation between PM2.5 and asthma prevalence was r = +0.887 (p &lt; 0.0001). However, variance decomposition revealed that 98.5% of the variation in asthma prevalence reflected stable structural differences between regions, not year-to-year changes. After removing between-region confounding through fixed effects, the regression coefficient on PM2.5 was β = −2.554 (SE = 0.825, p = 0.0024, within-R² = 0.080) (permutation-test robustness check, p = 0.0008), indicating no robust positive within-region temporal association. Sensitivity analyses were mostly, but not uniformly, supportive: a wild cluster bootstrap (p = 0.036) and a leave-one-region-out jackknife (β ranged −1.416 to −2.812 across 17 refits, all p &lt; 0.05) preserved the coefficient’s sign and significance, while excluding the COVID-19 pandemic years (2020–2021) attenuated it to non-significance (β = −2.113, p = 0.088) and a 3-year cumulative PM2.5 exposure specification instead produced a substantially larger, highly significant negative coefficient (β = −6.040, p &lt; 0.0001). </w:t>
       </w:r>
       <w:r>
         <w:rPr>
@@ -264,7 +239,6 @@
           <w:sz w:val="22"/>
           <w:szCs w:val="22"/>
         </w:rPr>
-        <w:t xml:space="preserve">Conclusions. </w:t>
       </w:r>
       <w:r>
         <w:rPr>
@@ -276,7 +250,6 @@
           <w:sz w:val="22"/>
           <w:szCs w:val="22"/>
         </w:rPr>
-        <w:t>The strong cross-sectional correlation between regional PM2.5 and pediatric asthma prevalence in the Philippines is driven by between-region structural differences — particularly the fact that more polluted regions are also more urbanized and have greater diagnostic capacity — rather than by real temporal pollution effects. These findings highlight the critical importance of panel designs and within-unit variance assessment in ecological environmental epidemiology. These sensitivity analyses show the fixed-effects estimate is reasonably, though not perfectly, robust: it is sensitive to the National Capital Region and to the COVID-19 pandemic years specifically, and strengthens rather than weakens under a more biologically plausible cumulative-exposure specification.</w:t>
       </w:r>
     </w:p>
     <w:p>
@@ -298,7 +271,7 @@
     </w:p>
     <w:p>
       <w:pPr>
-        <w:spacing w:after="160" w:line="276"/>
+        <w:spacing w:after="160" w:line="360"/>
         <w:jc w:val="both"/>
       </w:pPr>
       <w:r>
@@ -311,12 +284,12 @@
           <w:sz w:val="22"/>
           <w:szCs w:val="22"/>
         </w:rPr>
-        <w:t xml:space="preserve">Air pollution is one of the most serious environmental health problems in the world today. According to the World Health Organization, air pollution is responsible for approximately 6.7 million premature deaths each year, making it one of the leading risk factors for disease and death. Among the many harmful components of air pollution, fine particulate matter — particles with a diameter of 2.5 micrometers or less, known as PM2.5 — is considered especially dangerous because these particles are small enough to penetrate deep into the lungs and even enter the bloodstream.</w:t>
-      </w:r>
-    </w:p>
-    <w:p>
-      <w:pPr>
-        <w:spacing w:after="160" w:line="276"/>
+        <w:t xml:space="preserve">Air pollution is one of the most serious environmental health problems in the world today, responsible for approximately 6.7 million premature deaths each year according to the World Health Organization. Among its many harmful components, fine particulate matter (PM2.5 — particles ≤2.5 micrometers in diameter) is especially dangerous because it is small enough to penetrate deep into the lungs and even enter the bloodstream.</w:t>
+      </w:r>
+    </w:p>
+    <w:p>
+      <w:pPr>
+        <w:spacing w:after="160" w:line="360"/>
         <w:jc w:val="both"/>
       </w:pPr>
       <w:r>
@@ -334,7 +307,7 @@
     </w:p>
     <w:p>
       <w:pPr>
-        <w:spacing w:after="160" w:line="276"/>
+        <w:spacing w:after="160" w:line="360"/>
         <w:jc w:val="both"/>
       </w:pPr>
       <w:r>
@@ -347,12 +320,12 @@
           <w:sz w:val="22"/>
           <w:szCs w:val="22"/>
         </w:rPr>
-        <w:t xml:space="preserve">The Philippines faces a significant air quality challenge. As one of the most rapidly urbanizing countries in Southeast Asia, the country is experiencing growing pollution from motor vehicles, industrial emissions, open burning, and other sources. Davao City — the largest city on the island of Mindanao and one of the Philippines' fastest-growing urban centers — serves as a meaningful entry point for understanding these dynamics. Despite its reputation as a relatively green city by Philippine standards, Davao has seen increasing traffic congestion and economic activity that raise legitimate questions about the quality of the air that its residents, including hundreds of thousands of school-age children, breathe every day.</w:t>
-      </w:r>
-    </w:p>
-    <w:p>
-      <w:pPr>
-        <w:spacing w:after="160" w:line="276"/>
+        <w:t xml:space="preserve">The Philippines faces a significant air quality challenge. As one of the most rapidly urbanizing countries in Southeast Asia, the country is experiencing growing pollution from motor vehicles, industrial emissions, open burning, and other sources — raising legitimate questions about the air quality that hundreds of thousands of Filipino school-age children breathe every day.</w:t>
+      </w:r>
+    </w:p>
+    <w:p>
+      <w:pPr>
+        <w:spacing w:after="160" w:line="360"/>
         <w:jc w:val="both"/>
       </w:pPr>
       <w:r>
@@ -365,12 +338,12 @@
           <w:sz w:val="22"/>
           <w:szCs w:val="22"/>
         </w:rPr>
-        <w:t xml:space="preserve">Globally, asthma is one of the most common chronic diseases of childhood. In the Philippines, a 2023 study by Ho et al. found that pediatric asthma carries a significant and growing burden, while Yang et al. (2024) project that asthma trends across the Western Pacific region will continue to rise through 2045 (1,2). Yet despite this recognized burden, the relationship between ambient PM2.5 and pediatric asthma within the Philippines has not been studied at the subnational, regional level using panel methods that properly account for structural differences between regions and shared national trends over time.</w:t>
-      </w:r>
-    </w:p>
-    <w:p>
-      <w:pPr>
-        <w:spacing w:after="160" w:line="276"/>
+        <w:t>Globally, asthma is one of the most common chronic diseases of childhood. In the Philippines, a 2023 study by Legaspi et al. found that pediatric asthma carries a significant and growing burden, while Yang et al. (2024) project that asthma trends across the Western Pacific region will continue to rise through 2045 (1,2). Yet despite this recognized burden, the relationship between ambient PM2.5 and pediatric asthma within the Philippines has not been studied at the subnational, regional level using panel methods that properly account for structural differences between regions and shared national trends over time.</w:t>
+      </w:r>
+    </w:p>
+    <w:p>
+      <w:pPr>
+        <w:spacing w:after="160" w:line="360"/>
         <w:jc w:val="both"/>
       </w:pPr>
       <w:r>
@@ -388,7 +361,7 @@
     </w:p>
     <w:p>
       <w:pPr>
-        <w:spacing w:after="160" w:line="276"/>
+        <w:spacing w:after="160" w:line="360"/>
         <w:jc w:val="both"/>
       </w:pPr>
       <w:r>
@@ -440,7 +413,7 @@
     </w:p>
     <w:p>
       <w:pPr>
-        <w:spacing w:after="160" w:line="276"/>
+        <w:spacing w:after="160" w:line="360"/>
         <w:jc w:val="both"/>
       </w:pPr>
       <w:r>
@@ -475,7 +448,7 @@
     </w:p>
     <w:p>
       <w:pPr>
-        <w:spacing w:after="160" w:line="276"/>
+        <w:spacing w:after="160" w:line="360"/>
         <w:jc w:val="both"/>
       </w:pPr>
       <w:r>
@@ -493,7 +466,7 @@
     </w:p>
     <w:p>
       <w:pPr>
-        <w:spacing w:after="160" w:line="276"/>
+        <w:spacing w:after="160" w:line="360"/>
         <w:jc w:val="both"/>
       </w:pPr>
       <w:r>
@@ -528,7 +501,7 @@
     </w:p>
     <w:p>
       <w:pPr>
-        <w:spacing w:after="160" w:line="276"/>
+        <w:spacing w:after="160" w:line="360"/>
         <w:jc w:val="both"/>
       </w:pPr>
       <w:r>
@@ -563,7 +536,7 @@
     </w:p>
     <w:p>
       <w:pPr>
-        <w:spacing w:after="160" w:line="276"/>
+        <w:spacing w:after="160" w:line="360"/>
         <w:jc w:val="both"/>
       </w:pPr>
       <w:r>
@@ -581,7 +554,7 @@
     </w:p>
     <w:p>
       <w:pPr>
-        <w:spacing w:after="200" w:line="276"/>
+        <w:spacing w:after="200" w:line="360"/>
         <w:jc w:val="center"/>
       </w:pPr>
       <w:r>
@@ -732,7 +705,7 @@
     </w:p>
     <w:p>
       <w:pPr>
-        <w:spacing w:after="160" w:line="276"/>
+        <w:spacing w:after="160" w:line="360"/>
         <w:jc w:val="both"/>
       </w:pPr>
       <w:r>
@@ -745,7 +718,95 @@
           <w:sz w:val="22"/>
           <w:szCs w:val="22"/>
         </w:rPr>
-        <w:t>where αᵢ is a region fixed effect (absorbing all time-invariant regional differences) and γₜ is a year fixed effect (absorbing shared national-level trends). Standard errors were clustered by region. We estimated both levels (Model A) and log-log (Model B) specifications. As a robustness check, we computed first-differences (year-over-year changes) within each region and correlated these changes across all 17 regions (n = 153 pairs). As a robustness check given the modest number of clusters, we additionally validated the primary coefficient using label- and block-permutation tests (5,000 iterations each; see Results). In a later session, five additional robustness checks were added to the primary coefficient — a wild cluster bootstrap, a leave-one-region-out jackknife, re-estimation excluding the 2020–2021 COVID-19 pandemic years, a Hausman specification test of fixed effects against random effects, and a Moran's I test for residual spatial autocorrelation — plus two exploratory analyses: lagged/cumulative PM2.5 exposure specifications and a minimum-detectable-effect calculation (see Results). A further session added an eighth check, a placebo/negative-control test using an outcome with no plausible PM2.5 pathway (see Results).</w:t>
+        <w:t>where αᵢ is a region fixed effect (absorbing all time-invariant regional differences) and γₜ is a year fixed effect (absorbing shared national-level trends). Standard errors were clustered by region. We estimated both levels (Model A) and log-log (Model B) specifications. As a robustness check, we computed first-differences (year-over-year changes) within each region and correlated these changes across all 17 regions (n = 153 pairs). As a robustness check given the modest number of clusters, we additionally validated the primary coefficient using label- and block-permutation tests (5,000 iterations each; see Results). In a later session, five additional robustness checks were added to the primary coefficient — a wild cluster bootstrap, a leave-one-region-out jackknife, re-estimation excluding the 2020–2021 COVID-19 pandemic years, a Hausman specification test of fixed effects against random effects, and a Moran's I test for residual spatial autocorrelation — plus two exploratory analyses: lagged/cumulative PM2.5 exposure specifications and a minimum-detectable-effect calculation (see Results). A further session added an eighth check, a placebo/negative-control test using an outcome with no plausible PM2.5 pathway (see Results). Because the same-year two-way fixed-effects model is the single pre-specified primary specification, the checks above test its stability and precision rather than search across alternatives, and are not treated as a multiple-comparisons family requiring correction. The five-outcome comparison and four exposure-timing specifications below are labeled post hoc as exploratory analyses, with Holm-Bonferroni-corrected p-values (Holm, 1979) reported separately within each family (see Synthesis of Sensitivity Analyses in the Discussion for a full accounting).</w:t>
+      </w:r>
+    </w:p>
+    <w:p>
+      <w:pPr>
+        <w:spacing w:before="220" w:after="120"/>
+      </w:pPr>
+      <w:r>
+        <w:rPr>
+          <w:rFonts w:ascii="Times New Roman" w:hAnsi="Times New Roman"/>
+          <w:b/>
+          <w:i w:val="0"/>
+          <w:sz w:val="22"/>
+        </w:rPr>
+        <w:t>Identification Strategy and Its Limits</w:t>
+      </w:r>
+    </w:p>
+    <w:p>
+      <w:pPr>
+        <w:spacing w:after="160"/>
+        <w:jc w:val="both"/>
+      </w:pPr>
+      <w:r>
+        <w:rPr>
+          <w:rFonts w:ascii="Times New Roman" w:hAnsi="Times New Roman"/>
+          <w:b w:val="0"/>
+          <w:i w:val="0"/>
+          <w:sz w:val="22"/>
+        </w:rPr>
+        <w:t>This design identifies β from within-region, year-to-year covariation between PM2.5 and asthma prevalence, after removing all time-invariant regional differences (region fixed effects) and all shared national-level shocks (year fixed effects). The core identifying assumption is that, conditional on these two sets of effects, no remaining time-varying confounder is correlated with both PM2.5 and asthma prevalence within a region — most plausibly threatened by differential regional trajectories in healthcare access or diagnostic capacity (for example, the staggered rollout of the Universal Health Care Act and PhilHealth expansion across regions), rather than by differences in regional levels, which region fixed effects already remove. Of the robustness checks reported below, four (the permutation tests, wild cluster bootstrap, leave-one-region-out jackknife, and Moran’s I test) evaluate whether the standard error on β is trustworthy given the small number of clusters (17 regions); they do not test whether β itself could be confounded by a differential regional trajectory. The region-specific linear time trends check does test that directly, by allowing each region its own secular trend in addition to its own level. Consistent with the same logic already applied to the leave-one-region-out jackknife and the COVID-19 exclusion check — testing the stability of one pre-specified estimate rather than searching across candidate specifications — the region-specific trends check is not included in either Holm-Bonferroni-corrected family reported in the Results (the five-outcome comparison or the lag-structure sweep) and is reported at its raw significance level, consistent with those two checks.</w:t>
+      </w:r>
+    </w:p>
+    <w:p>
+      <w:pPr>
+        <w:jc w:val="center"/>
+      </w:pPr>
+      <w:r>
+        <w:drawing>
+          <wp:inline xmlns:a="http://schemas.openxmlformats.org/drawingml/2006/main" xmlns:pic="http://schemas.openxmlformats.org/drawingml/2006/picture">
+            <wp:extent cx="3749039" cy="2707639"/>
+            <wp:docPr id="6" name="Picture 6"/>
+            <wp:cNvGraphicFramePr>
+              <a:graphicFrameLocks noChangeAspect="1"/>
+            </wp:cNvGraphicFramePr>
+            <a:graphic>
+              <a:graphicData uri="http://schemas.openxmlformats.org/drawingml/2006/picture">
+                <pic:pic>
+                  <pic:nvPicPr>
+                    <pic:cNvPr id="0" name="image.png"/>
+                    <pic:cNvPicPr/>
+                  </pic:nvPicPr>
+                  <pic:blipFill>
+                    <a:blip r:embed="rId18"/>
+                    <a:stretch>
+                      <a:fillRect/>
+                    </a:stretch>
+                  </pic:blipFill>
+                  <pic:spPr>
+                    <a:xfrm>
+                      <a:off x="0" y="0"/>
+                      <a:ext cx="3749039" cy="2707639"/>
+                    </a:xfrm>
+                    <a:prstGeom prst="rect"/>
+                  </pic:spPr>
+                </pic:pic>
+              </a:graphicData>
+            </a:graphic>
+          </wp:inline>
+        </w:drawing>
+      </w:r>
+    </w:p>
+    <w:p>
+      <w:r>
+        <w:rPr>
+          <w:rFonts w:ascii="Times New Roman" w:hAnsi="Times New Roman"/>
+          <w:b/>
+          <w:i/>
+          <w:sz w:val="19"/>
+        </w:rPr>
+        <w:t xml:space="preserve">Figure 10. </w:t>
+      </w:r>
+      <w:r>
+        <w:rPr>
+          <w:rFonts w:ascii="Times New Roman" w:hAnsi="Times New Roman"/>
+          <w:b w:val="0"/>
+          <w:i/>
+          <w:sz w:val="19"/>
+        </w:rPr>
+        <w:t>Confounding structure of the PM2.5 → pediatric asthma prevalence association. Region- and year-level confounding is closed by the two-way fixed-effects design (dashed gray arrows). A residual path — unobserved region × year confounders such as differential healthcare-access rollout, smoking prevalence, or local socioeconomic shifts — is not closed by this design and is the primary remaining identification threat (solid red arrow), motivating the region-specific-trends check (Results) and named in Limitations.</w:t>
       </w:r>
     </w:p>
     <w:p>
@@ -784,7 +845,7 @@
     </w:p>
     <w:p>
       <w:pPr>
-        <w:spacing w:after="160" w:line="276"/>
+        <w:spacing w:after="160" w:line="360"/>
         <w:jc w:val="both"/>
       </w:pPr>
       <w:r>
@@ -802,7 +863,7 @@
     </w:p>
     <w:p>
       <w:pPr>
-        <w:spacing w:after="240" w:line="276"/>
+        <w:spacing w:after="240" w:line="360"/>
         <w:jc w:val="both"/>
       </w:pPr>
       <w:r>
@@ -1470,7 +1531,7 @@
     </w:p>
     <w:p>
       <w:pPr>
-        <w:spacing w:after="160" w:line="276"/>
+        <w:spacing w:after="160" w:line="360"/>
         <w:jc w:val="both"/>
       </w:pPr>
       <w:r>
@@ -1534,7 +1595,7 @@
     </w:p>
     <w:p>
       <w:pPr>
-        <w:spacing w:after="240" w:line="276"/>
+        <w:spacing w:after="240" w:line="360"/>
         <w:jc w:val="both"/>
       </w:pPr>
       <w:r>
@@ -1610,7 +1671,7 @@
     </w:p>
     <w:p>
       <w:pPr>
-        <w:spacing w:after="240" w:line="276"/>
+        <w:spacing w:after="240" w:line="360"/>
         <w:jc w:val="both"/>
       </w:pPr>
       <w:r>
@@ -1657,7 +1718,7 @@
     </w:p>
     <w:p>
       <w:pPr>
-        <w:spacing w:after="160" w:line="276"/>
+        <w:spacing w:after="160" w:line="360"/>
         <w:jc w:val="both"/>
       </w:pPr>
       <w:r>
@@ -1721,7 +1782,7 @@
     </w:p>
     <w:p>
       <w:pPr>
-        <w:spacing w:after="240" w:line="276"/>
+        <w:spacing w:after="240" w:line="360"/>
         <w:jc w:val="both"/>
       </w:pPr>
       <w:r>
@@ -1797,7 +1858,7 @@
     </w:p>
     <w:p>
       <w:pPr>
-        <w:spacing w:after="240" w:line="276"/>
+        <w:spacing w:after="240" w:line="360"/>
         <w:jc w:val="both"/>
       </w:pPr>
       <w:r>
@@ -1844,7 +1905,7 @@
     </w:p>
     <w:p>
       <w:pPr>
-        <w:spacing w:after="160" w:line="276"/>
+        <w:spacing w:after="160" w:line="360"/>
         <w:jc w:val="both"/>
       </w:pPr>
       <w:r>
@@ -1862,7 +1923,7 @@
     </w:p>
     <w:p>
       <w:pPr>
-        <w:spacing w:after="240" w:line="276"/>
+        <w:spacing w:after="240" w:line="360"/>
         <w:jc w:val="both"/>
       </w:pPr>
       <w:r>
@@ -2205,7 +2266,7 @@
     </w:p>
     <w:p>
       <w:pPr>
-        <w:spacing w:after="160" w:line="276"/>
+        <w:spacing w:after="160" w:line="360"/>
         <w:jc w:val="both"/>
       </w:pPr>
       <w:r>
@@ -2223,7 +2284,7 @@
     </w:p>
     <w:p>
       <w:pPr>
-        <w:spacing w:after="160" w:line="276"/>
+        <w:spacing w:after="160" w:line="360"/>
         <w:jc w:val="both"/>
       </w:pPr>
       <w:r>
@@ -2241,7 +2302,7 @@
     </w:p>
     <w:p>
       <w:pPr>
-        <w:spacing w:after="240" w:line="276"/>
+        <w:spacing w:after="240" w:line="360"/>
         <w:jc w:val="both"/>
       </w:pPr>
       <w:r>
@@ -2745,6 +2806,957 @@
     </w:p>
     <w:p>
       <w:pPr>
+        <w:spacing w:before="220" w:after="120"/>
+      </w:pPr>
+      <w:r>
+        <w:rPr>
+          <w:rFonts w:ascii="Times New Roman" w:hAnsi="Times New Roman"/>
+          <w:b/>
+          <w:i w:val="0"/>
+          <w:sz w:val="22"/>
+        </w:rPr>
+        <w:t>Robustness Check: Region-Specific Linear Time Trends</w:t>
+      </w:r>
+    </w:p>
+    <w:p>
+      <w:pPr>
+        <w:spacing w:after="160"/>
+        <w:jc w:val="both"/>
+      </w:pPr>
+      <w:r>
+        <w:rPr>
+          <w:rFonts w:ascii="Times New Roman" w:hAnsi="Times New Roman"/>
+          <w:b w:val="0"/>
+          <w:i w:val="0"/>
+          <w:sz w:val="22"/>
+        </w:rPr>
+        <w:t>The checks that follow this one test whether the standard error on the primary coefficient is trustworthy given a modest number of clusters (see Identification Strategy and Its Limits, Methods); this check instead tests the identifying assumption itself. We re-estimated the primary model with one additional linear time trend per region (17 extra parameters: regionᵢ × t) alongside the existing region and year fixed effects — a standard approach in applied panel econometrics for testing whether a result reflects genuine within-region co-movement or a differential regional trajectory that happens to correlate with each region’s own PM2.5 trend (e.g. Wolfers, 2006).</w:t>
+      </w:r>
+    </w:p>
+    <w:p>
+      <w:pPr>
+        <w:spacing w:after="160"/>
+        <w:jc w:val="both"/>
+      </w:pPr>
+      <w:r>
+        <w:rPr>
+          <w:rFonts w:ascii="Times New Roman" w:hAnsi="Times New Roman"/>
+          <w:b w:val="0"/>
+          <w:i w:val="0"/>
+          <w:sz w:val="22"/>
+        </w:rPr>
+        <w:t>Adding region-specific trends shrank the coefficient from β = −2.554 (p = 0.0024) to β = −0.937 (SE = 0.446, p = 0.038, n = 170) — a 63% reduction in magnitude that narrowly survives conventional significance. This is a demanding specification (18 parameters estimated from 170 observations; within-R² rises mechanically from 0.080 to 0.791, since the region-specific trends absorb most of the panel’s variance, leaving relatively little residual variation to identify β from), so this result is better read as a lower bound on how much of the primary coefficient could plausibly reflect differential regional trajectories rather than a precise re-estimate in its own right. Taken at face value, it shows the primary result is not fully robust to letting each region follow its own trend — a materially more fragile picture than the standard-error-focused checks below suggest on their own, and one that reinforces, rather than undermines, this manuscript’s existing caution against over-reading the primary coefficient’s sign or magnitude as a confirmed effect.</w:t>
+      </w:r>
+    </w:p>
+    <w:p>
+      <w:pPr>
+        <w:spacing w:before="220" w:after="120"/>
+      </w:pPr>
+      <w:r>
+        <w:rPr>
+          <w:rFonts w:ascii="Times New Roman" w:hAnsi="Times New Roman"/>
+          <w:b/>
+          <w:i w:val="0"/>
+          <w:sz w:val="22"/>
+        </w:rPr>
+        <w:t>SE-Reliability Checks: Small-Cluster Inference and Spatial Autocorrelation</w:t>
+      </w:r>
+    </w:p>
+    <w:p>
+      <w:pPr>
+        <w:spacing w:after="160"/>
+        <w:jc w:val="both"/>
+      </w:pPr>
+      <w:r>
+        <w:rPr>
+          <w:rFonts w:ascii="Times New Roman" w:hAnsi="Times New Roman"/>
+          <w:b w:val="0"/>
+          <w:i w:val="0"/>
+          <w:sz w:val="22"/>
+        </w:rPr>
+        <w:t>The primary model clusters standard errors by region, but with only 17 clusters that correction can itself be unreliable (Cameron &amp; Miller, 2015). Six checks address this directly — none change the point estimate itself, only the assessment of its precision — and are summarized in Table 4 rather than as six separate subsections.</w:t>
+      </w:r>
+    </w:p>
+    <w:p>
+      <w:pPr>
+        <w:spacing w:before="120" w:after="80"/>
+      </w:pPr>
+      <w:r>
+        <w:rPr>
+          <w:rFonts w:ascii="Times New Roman" w:hAnsi="Times New Roman"/>
+          <w:b/>
+          <w:i/>
+          <w:sz w:val="21"/>
+        </w:rPr>
+        <w:t>Table 4. SE-reliability checks, summarized (primary estimate: β = −2.554, n = 170 throughout):</w:t>
+      </w:r>
+    </w:p>
+    <w:tbl>
+      <w:tblPr>
+        <w:tblW w:type="dxa" w:w="9350"/>
+        <w:tblBorders>
+          <w:top w:val="single" w:color="000000" w:sz="4"/>
+          <w:left w:val="none"/>
+          <w:bottom w:val="single" w:color="000000" w:sz="4"/>
+          <w:right w:val="none"/>
+          <w:insideH w:val="single" w:color="999999" w:sz="2"/>
+          <w:insideV w:val="none"/>
+        </w:tblBorders>
+      </w:tblPr>
+      <w:tblGrid>
+        <w:gridCol w:w="1800"/>
+        <w:gridCol w:w="2600"/>
+        <w:gridCol w:w="3100"/>
+        <w:gridCol w:w="1850"/>
+      </w:tblGrid>
+      <w:tr>
+        <w:trPr>
+          <w:tblHeader/>
+        </w:trPr>
+        <w:tc>
+          <w:tcPr>
+            <w:tcW w:type="dxa" w:w="1800"/>
+            <w:shd w:fill="D9D9D9" w:val="clear"/>
+            <w:tcMar>
+              <w:top w:type="dxa" w:w="80"/>
+              <w:left w:type="dxa" w:w="100"/>
+              <w:bottom w:type="dxa" w:w="80"/>
+              <w:right w:type="dxa" w:w="100"/>
+            </w:tcMar>
+            <w:vAlign w:val="center"/>
+          </w:tcPr>
+          <w:p>
+            <w:pPr>
+              <w:jc w:val="center"/>
+            </w:pPr>
+            <w:r>
+              <w:rPr>
+                <w:rFonts w:ascii="Times New Roman" w:cs="Times New Roman" w:eastAsia="Times New Roman" w:hAnsi="Times New Roman"/>
+                <w:b/>
+                <w:bCs/>
+                <w:i w:val="0"/>
+                <w:iCs w:val="false"/>
+                <w:sz w:val="21"/>
+                <w:szCs w:val="20"/>
+              </w:rPr>
+              <w:t>Check</w:t>
+            </w:r>
+          </w:p>
+        </w:tc>
+        <w:tc>
+          <w:tcPr>
+            <w:tcW w:type="dxa" w:w="2600"/>
+            <w:shd w:fill="D9D9D9" w:val="clear"/>
+            <w:tcMar>
+              <w:top w:type="dxa" w:w="80"/>
+              <w:left w:type="dxa" w:w="100"/>
+              <w:bottom w:type="dxa" w:w="80"/>
+              <w:right w:type="dxa" w:w="100"/>
+            </w:tcMar>
+            <w:vAlign w:val="center"/>
+          </w:tcPr>
+          <w:p>
+            <w:pPr>
+              <w:jc w:val="center"/>
+            </w:pPr>
+            <w:r>
+              <w:rPr>
+                <w:rFonts w:ascii="Times New Roman" w:cs="Times New Roman" w:eastAsia="Times New Roman" w:hAnsi="Times New Roman"/>
+                <w:b/>
+                <w:bCs/>
+                <w:i w:val="0"/>
+                <w:iCs w:val="false"/>
+                <w:sz w:val="21"/>
+                <w:szCs w:val="20"/>
+              </w:rPr>
+              <w:t>What it tests</w:t>
+            </w:r>
+          </w:p>
+        </w:tc>
+        <w:tc>
+          <w:tcPr>
+            <w:tcW w:type="dxa" w:w="3100"/>
+            <w:shd w:fill="D9D9D9" w:val="clear"/>
+            <w:tcMar>
+              <w:top w:type="dxa" w:w="80"/>
+              <w:left w:type="dxa" w:w="100"/>
+              <w:bottom w:type="dxa" w:w="80"/>
+              <w:right w:type="dxa" w:w="100"/>
+            </w:tcMar>
+            <w:vAlign w:val="center"/>
+          </w:tcPr>
+          <w:p>
+            <w:pPr>
+              <w:jc w:val="center"/>
+            </w:pPr>
+            <w:r>
+              <w:rPr>
+                <w:rFonts w:ascii="Times New Roman" w:cs="Times New Roman" w:eastAsia="Times New Roman" w:hAnsi="Times New Roman"/>
+                <w:b/>
+                <w:bCs/>
+                <w:i w:val="0"/>
+                <w:iCs w:val="false"/>
+                <w:sz w:val="21"/>
+                <w:szCs w:val="20"/>
+              </w:rPr>
+              <w:t>Key result</w:t>
+            </w:r>
+          </w:p>
+        </w:tc>
+        <w:tc>
+          <w:tcPr>
+            <w:tcW w:type="dxa" w:w="1850"/>
+            <w:shd w:fill="D9D9D9" w:val="clear"/>
+            <w:tcMar>
+              <w:top w:type="dxa" w:w="80"/>
+              <w:left w:type="dxa" w:w="100"/>
+              <w:bottom w:type="dxa" w:w="80"/>
+              <w:right w:type="dxa" w:w="100"/>
+            </w:tcMar>
+            <w:vAlign w:val="center"/>
+          </w:tcPr>
+          <w:p>
+            <w:pPr>
+              <w:jc w:val="center"/>
+            </w:pPr>
+            <w:r>
+              <w:rPr>
+                <w:rFonts w:ascii="Times New Roman" w:cs="Times New Roman" w:eastAsia="Times New Roman" w:hAnsi="Times New Roman"/>
+                <w:b/>
+                <w:bCs/>
+                <w:i w:val="0"/>
+                <w:iCs w:val="false"/>
+                <w:sz w:val="21"/>
+                <w:szCs w:val="20"/>
+              </w:rPr>
+              <w:t>Verdict</w:t>
+            </w:r>
+          </w:p>
+        </w:tc>
+      </w:tr>
+      <w:tr>
+        <w:tc>
+          <w:tcPr>
+            <w:tcW w:type="dxa" w:w="1800"/>
+            <w:tcMar>
+              <w:top w:type="dxa" w:w="80"/>
+              <w:left w:type="dxa" w:w="100"/>
+              <w:bottom w:type="dxa" w:w="80"/>
+              <w:right w:type="dxa" w:w="100"/>
+            </w:tcMar>
+            <w:vAlign w:val="center"/>
+          </w:tcPr>
+          <w:p>
+            <w:pPr>
+              <w:jc w:val="center"/>
+            </w:pPr>
+            <w:r>
+              <w:rPr>
+                <w:rFonts w:ascii="Times New Roman" w:cs="Times New Roman" w:eastAsia="Times New Roman" w:hAnsi="Times New Roman"/>
+                <w:b w:val="0"/>
+                <w:bCs w:val="false"/>
+                <w:i w:val="0"/>
+                <w:iCs w:val="false"/>
+                <w:sz w:val="21"/>
+                <w:szCs w:val="20"/>
+              </w:rPr>
+              <w:t>Permutation tests</w:t>
+              <w:br/>
+              <w:t>(label &amp; block, 5,000 iter. each)</w:t>
+            </w:r>
+          </w:p>
+        </w:tc>
+        <w:tc>
+          <w:tcPr>
+            <w:tcW w:type="dxa" w:w="2600"/>
+            <w:tcMar>
+              <w:top w:type="dxa" w:w="80"/>
+              <w:left w:type="dxa" w:w="100"/>
+              <w:bottom w:type="dxa" w:w="80"/>
+              <w:right w:type="dxa" w:w="100"/>
+            </w:tcMar>
+            <w:vAlign w:val="center"/>
+          </w:tcPr>
+          <w:p>
+            <w:pPr>
+              <w:jc w:val="center"/>
+            </w:pPr>
+            <w:r>
+              <w:rPr>
+                <w:rFonts w:ascii="Times New Roman" w:cs="Times New Roman" w:eastAsia="Times New Roman" w:hAnsi="Times New Roman"/>
+                <w:b w:val="0"/>
+                <w:bCs w:val="false"/>
+                <w:i w:val="0"/>
+                <w:iCs w:val="false"/>
+                <w:sz w:val="21"/>
+                <w:szCs w:val="20"/>
+              </w:rPr>
+              <w:t>Randomization-inference p-value under H0: β = 0</w:t>
+            </w:r>
+          </w:p>
+        </w:tc>
+        <w:tc>
+          <w:tcPr>
+            <w:tcW w:type="dxa" w:w="3100"/>
+            <w:tcMar>
+              <w:top w:type="dxa" w:w="80"/>
+              <w:left w:type="dxa" w:w="100"/>
+              <w:bottom w:type="dxa" w:w="80"/>
+              <w:right w:type="dxa" w:w="100"/>
+            </w:tcMar>
+            <w:vAlign w:val="center"/>
+          </w:tcPr>
+          <w:p>
+            <w:pPr>
+              <w:jc w:val="center"/>
+            </w:pPr>
+            <w:r>
+              <w:rPr>
+                <w:rFonts w:ascii="Times New Roman" w:cs="Times New Roman" w:eastAsia="Times New Roman" w:hAnsi="Times New Roman"/>
+                <w:b w:val="0"/>
+                <w:bCs w:val="false"/>
+                <w:i w:val="0"/>
+                <w:iCs w:val="false"/>
+                <w:sz w:val="21"/>
+                <w:szCs w:val="20"/>
+              </w:rPr>
+              <w:t>Label p = 0.0048; block p = 0.0008</w:t>
+            </w:r>
+          </w:p>
+        </w:tc>
+        <w:tc>
+          <w:tcPr>
+            <w:tcW w:type="dxa" w:w="1850"/>
+            <w:tcMar>
+              <w:top w:type="dxa" w:w="80"/>
+              <w:left w:type="dxa" w:w="100"/>
+              <w:bottom w:type="dxa" w:w="80"/>
+              <w:right w:type="dxa" w:w="100"/>
+            </w:tcMar>
+            <w:vAlign w:val="center"/>
+          </w:tcPr>
+          <w:p>
+            <w:pPr>
+              <w:jc w:val="center"/>
+            </w:pPr>
+            <w:r>
+              <w:rPr>
+                <w:rFonts w:ascii="Times New Roman" w:cs="Times New Roman" w:eastAsia="Times New Roman" w:hAnsi="Times New Roman"/>
+                <w:b w:val="0"/>
+                <w:bCs w:val="false"/>
+                <w:i w:val="0"/>
+                <w:iCs w:val="false"/>
+                <w:sz w:val="21"/>
+                <w:szCs w:val="20"/>
+              </w:rPr>
+              <w:t>Confirms significance</w:t>
+            </w:r>
+          </w:p>
+        </w:tc>
+      </w:tr>
+      <w:tr>
+        <w:tc>
+          <w:tcPr>
+            <w:tcW w:type="dxa" w:w="1800"/>
+            <w:tcMar>
+              <w:top w:type="dxa" w:w="80"/>
+              <w:left w:type="dxa" w:w="100"/>
+              <w:bottom w:type="dxa" w:w="80"/>
+              <w:right w:type="dxa" w:w="100"/>
+            </w:tcMar>
+            <w:vAlign w:val="center"/>
+          </w:tcPr>
+          <w:p>
+            <w:pPr>
+              <w:jc w:val="center"/>
+            </w:pPr>
+            <w:r>
+              <w:rPr>
+                <w:rFonts w:ascii="Times New Roman" w:cs="Times New Roman" w:eastAsia="Times New Roman" w:hAnsi="Times New Roman"/>
+                <w:b w:val="0"/>
+                <w:bCs w:val="false"/>
+                <w:i w:val="0"/>
+                <w:iCs w:val="false"/>
+                <w:sz w:val="21"/>
+                <w:szCs w:val="20"/>
+              </w:rPr>
+              <w:t>Wild cluster bootstrap</w:t>
+              <w:br/>
+              <w:t>(WCR, 5,000 reps)</w:t>
+            </w:r>
+          </w:p>
+        </w:tc>
+        <w:tc>
+          <w:tcPr>
+            <w:tcW w:type="dxa" w:w="2600"/>
+            <w:tcMar>
+              <w:top w:type="dxa" w:w="80"/>
+              <w:left w:type="dxa" w:w="100"/>
+              <w:bottom w:type="dxa" w:w="80"/>
+              <w:right w:type="dxa" w:w="100"/>
+            </w:tcMar>
+            <w:vAlign w:val="center"/>
+          </w:tcPr>
+          <w:p>
+            <w:pPr>
+              <w:jc w:val="center"/>
+            </w:pPr>
+            <w:r>
+              <w:rPr>
+                <w:rFonts w:ascii="Times New Roman" w:cs="Times New Roman" w:eastAsia="Times New Roman" w:hAnsi="Times New Roman"/>
+                <w:b w:val="0"/>
+                <w:bCs w:val="false"/>
+                <w:i w:val="0"/>
+                <w:iCs w:val="false"/>
+                <w:sz w:val="21"/>
+                <w:szCs w:val="20"/>
+              </w:rPr>
+              <w:t>Small-G (17-cluster) sign-flip bootstrap p-value</w:t>
+            </w:r>
+          </w:p>
+        </w:tc>
+        <w:tc>
+          <w:tcPr>
+            <w:tcW w:type="dxa" w:w="3100"/>
+            <w:tcMar>
+              <w:top w:type="dxa" w:w="80"/>
+              <w:left w:type="dxa" w:w="100"/>
+              <w:bottom w:type="dxa" w:w="80"/>
+              <w:right w:type="dxa" w:w="100"/>
+            </w:tcMar>
+            <w:vAlign w:val="center"/>
+          </w:tcPr>
+          <w:p>
+            <w:pPr>
+              <w:jc w:val="center"/>
+            </w:pPr>
+            <w:r>
+              <w:rPr>
+                <w:rFonts w:ascii="Times New Roman" w:cs="Times New Roman" w:eastAsia="Times New Roman" w:hAnsi="Times New Roman"/>
+                <w:b w:val="0"/>
+                <w:bCs w:val="false"/>
+                <w:i w:val="0"/>
+                <w:iCs w:val="false"/>
+                <w:sz w:val="21"/>
+                <w:szCs w:val="20"/>
+              </w:rPr>
+              <w:t>p = 0.036 (t = −3.10)</w:t>
+            </w:r>
+          </w:p>
+        </w:tc>
+        <w:tc>
+          <w:tcPr>
+            <w:tcW w:type="dxa" w:w="1850"/>
+            <w:tcMar>
+              <w:top w:type="dxa" w:w="80"/>
+              <w:left w:type="dxa" w:w="100"/>
+              <w:bottom w:type="dxa" w:w="80"/>
+              <w:right w:type="dxa" w:w="100"/>
+            </w:tcMar>
+            <w:vAlign w:val="center"/>
+          </w:tcPr>
+          <w:p>
+            <w:pPr>
+              <w:jc w:val="center"/>
+            </w:pPr>
+            <w:r>
+              <w:rPr>
+                <w:rFonts w:ascii="Times New Roman" w:cs="Times New Roman" w:eastAsia="Times New Roman" w:hAnsi="Times New Roman"/>
+                <w:b w:val="0"/>
+                <w:bCs w:val="false"/>
+                <w:i w:val="0"/>
+                <w:iCs w:val="false"/>
+                <w:sz w:val="21"/>
+                <w:szCs w:val="20"/>
+              </w:rPr>
+              <w:t>Confirms significance, narrower margin</w:t>
+            </w:r>
+          </w:p>
+        </w:tc>
+      </w:tr>
+      <w:tr>
+        <w:tc>
+          <w:tcPr>
+            <w:tcW w:type="dxa" w:w="1800"/>
+            <w:tcMar>
+              <w:top w:type="dxa" w:w="80"/>
+              <w:left w:type="dxa" w:w="100"/>
+              <w:bottom w:type="dxa" w:w="80"/>
+              <w:right w:type="dxa" w:w="100"/>
+            </w:tcMar>
+            <w:vAlign w:val="center"/>
+          </w:tcPr>
+          <w:p>
+            <w:pPr>
+              <w:jc w:val="center"/>
+            </w:pPr>
+            <w:r>
+              <w:rPr>
+                <w:rFonts w:ascii="Times New Roman" w:cs="Times New Roman" w:eastAsia="Times New Roman" w:hAnsi="Times New Roman"/>
+                <w:b w:val="0"/>
+                <w:bCs w:val="false"/>
+                <w:i w:val="0"/>
+                <w:iCs w:val="false"/>
+                <w:sz w:val="21"/>
+                <w:szCs w:val="20"/>
+              </w:rPr>
+              <w:t>Leave-one-region-out jackknife</w:t>
+              <w:br/>
+              <w:t>(17 refits, Figure 7)</w:t>
+            </w:r>
+          </w:p>
+        </w:tc>
+        <w:tc>
+          <w:tcPr>
+            <w:tcW w:type="dxa" w:w="2600"/>
+            <w:tcMar>
+              <w:top w:type="dxa" w:w="80"/>
+              <w:left w:type="dxa" w:w="100"/>
+              <w:bottom w:type="dxa" w:w="80"/>
+              <w:right w:type="dxa" w:w="100"/>
+            </w:tcMar>
+            <w:vAlign w:val="center"/>
+          </w:tcPr>
+          <w:p>
+            <w:pPr>
+              <w:jc w:val="center"/>
+            </w:pPr>
+            <w:r>
+              <w:rPr>
+                <w:rFonts w:ascii="Times New Roman" w:cs="Times New Roman" w:eastAsia="Times New Roman" w:hAnsi="Times New Roman"/>
+                <w:b w:val="0"/>
+                <w:bCs w:val="false"/>
+                <w:i w:val="0"/>
+                <w:iCs w:val="false"/>
+                <w:sz w:val="21"/>
+                <w:szCs w:val="20"/>
+              </w:rPr>
+              <w:t>Stability of β across single-region exclusions</w:t>
+            </w:r>
+          </w:p>
+        </w:tc>
+        <w:tc>
+          <w:tcPr>
+            <w:tcW w:type="dxa" w:w="3100"/>
+            <w:tcMar>
+              <w:top w:type="dxa" w:w="80"/>
+              <w:left w:type="dxa" w:w="100"/>
+              <w:bottom w:type="dxa" w:w="80"/>
+              <w:right w:type="dxa" w:w="100"/>
+            </w:tcMar>
+            <w:vAlign w:val="center"/>
+          </w:tcPr>
+          <w:p>
+            <w:pPr>
+              <w:jc w:val="center"/>
+            </w:pPr>
+            <w:r>
+              <w:rPr>
+                <w:rFonts w:ascii="Times New Roman" w:cs="Times New Roman" w:eastAsia="Times New Roman" w:hAnsi="Times New Roman"/>
+                <w:b w:val="0"/>
+                <w:bCs w:val="false"/>
+                <w:i w:val="0"/>
+                <w:iCs w:val="false"/>
+                <w:sz w:val="21"/>
+                <w:szCs w:val="20"/>
+              </w:rPr>
+              <w:t>Range β = −1.416 to −2.812, all p &lt; 0.05; weakest excluding NCR (p = 0.045)</w:t>
+            </w:r>
+          </w:p>
+        </w:tc>
+        <w:tc>
+          <w:tcPr>
+            <w:tcW w:type="dxa" w:w="1850"/>
+            <w:tcMar>
+              <w:top w:type="dxa" w:w="80"/>
+              <w:left w:type="dxa" w:w="100"/>
+              <w:bottom w:type="dxa" w:w="80"/>
+              <w:right w:type="dxa" w:w="100"/>
+            </w:tcMar>
+            <w:vAlign w:val="center"/>
+          </w:tcPr>
+          <w:p>
+            <w:pPr>
+              <w:jc w:val="center"/>
+            </w:pPr>
+            <w:r>
+              <w:rPr>
+                <w:rFonts w:ascii="Times New Roman" w:cs="Times New Roman" w:eastAsia="Times New Roman" w:hAnsi="Times New Roman"/>
+                <w:b w:val="0"/>
+                <w:bCs w:val="false"/>
+                <w:i w:val="0"/>
+                <w:iCs w:val="false"/>
+                <w:sz w:val="21"/>
+                <w:szCs w:val="20"/>
+              </w:rPr>
+              <w:t>Confirms significance; NCR-sensitive</w:t>
+            </w:r>
+          </w:p>
+        </w:tc>
+      </w:tr>
+      <w:tr>
+        <w:tc>
+          <w:tcPr>
+            <w:tcW w:type="dxa" w:w="1800"/>
+            <w:tcMar>
+              <w:top w:type="dxa" w:w="80"/>
+              <w:left w:type="dxa" w:w="100"/>
+              <w:bottom w:type="dxa" w:w="80"/>
+              <w:right w:type="dxa" w:w="100"/>
+            </w:tcMar>
+            <w:vAlign w:val="center"/>
+          </w:tcPr>
+          <w:p>
+            <w:pPr>
+              <w:jc w:val="center"/>
+            </w:pPr>
+            <w:r>
+              <w:rPr>
+                <w:rFonts w:ascii="Times New Roman" w:cs="Times New Roman" w:eastAsia="Times New Roman" w:hAnsi="Times New Roman"/>
+                <w:b w:val="0"/>
+                <w:bCs w:val="false"/>
+                <w:i w:val="0"/>
+                <w:iCs w:val="false"/>
+                <w:sz w:val="21"/>
+                <w:szCs w:val="20"/>
+              </w:rPr>
+              <w:t>Moran’s I</w:t>
+              <w:br/>
+              <w:t>(k = 4 nearest-neighbor weights)</w:t>
+            </w:r>
+          </w:p>
+        </w:tc>
+        <w:tc>
+          <w:tcPr>
+            <w:tcW w:type="dxa" w:w="2600"/>
+            <w:tcMar>
+              <w:top w:type="dxa" w:w="80"/>
+              <w:left w:type="dxa" w:w="100"/>
+              <w:bottom w:type="dxa" w:w="80"/>
+              <w:right w:type="dxa" w:w="100"/>
+            </w:tcMar>
+            <w:vAlign w:val="center"/>
+          </w:tcPr>
+          <w:p>
+            <w:pPr>
+              <w:jc w:val="center"/>
+            </w:pPr>
+            <w:r>
+              <w:rPr>
+                <w:rFonts w:ascii="Times New Roman" w:cs="Times New Roman" w:eastAsia="Times New Roman" w:hAnsi="Times New Roman"/>
+                <w:b w:val="0"/>
+                <w:bCs w:val="false"/>
+                <w:i w:val="0"/>
+                <w:iCs w:val="false"/>
+                <w:sz w:val="21"/>
+                <w:szCs w:val="20"/>
+              </w:rPr>
+              <w:t>Spatial autocorrelation of residuals (SE validity)</w:t>
+            </w:r>
+          </w:p>
+        </w:tc>
+        <w:tc>
+          <w:tcPr>
+            <w:tcW w:type="dxa" w:w="3100"/>
+            <w:tcMar>
+              <w:top w:type="dxa" w:w="80"/>
+              <w:left w:type="dxa" w:w="100"/>
+              <w:bottom w:type="dxa" w:w="80"/>
+              <w:right w:type="dxa" w:w="100"/>
+            </w:tcMar>
+            <w:vAlign w:val="center"/>
+          </w:tcPr>
+          <w:p>
+            <w:pPr>
+              <w:jc w:val="center"/>
+            </w:pPr>
+            <w:r>
+              <w:rPr>
+                <w:rFonts w:ascii="Times New Roman" w:cs="Times New Roman" w:eastAsia="Times New Roman" w:hAnsi="Times New Roman"/>
+                <w:b w:val="0"/>
+                <w:bCs w:val="false"/>
+                <w:i w:val="0"/>
+                <w:iCs w:val="false"/>
+                <w:sz w:val="21"/>
+                <w:szCs w:val="20"/>
+              </w:rPr>
+              <w:t>I = −0.0017 (expected −0.063 under H0), p = 0.994</w:t>
+            </w:r>
+          </w:p>
+        </w:tc>
+        <w:tc>
+          <w:tcPr>
+            <w:tcW w:type="dxa" w:w="1850"/>
+            <w:tcMar>
+              <w:top w:type="dxa" w:w="80"/>
+              <w:left w:type="dxa" w:w="100"/>
+              <w:bottom w:type="dxa" w:w="80"/>
+              <w:right w:type="dxa" w:w="100"/>
+            </w:tcMar>
+            <w:vAlign w:val="center"/>
+          </w:tcPr>
+          <w:p>
+            <w:pPr>
+              <w:jc w:val="center"/>
+            </w:pPr>
+            <w:r>
+              <w:rPr>
+                <w:rFonts w:ascii="Times New Roman" w:cs="Times New Roman" w:eastAsia="Times New Roman" w:hAnsi="Times New Roman"/>
+                <w:b w:val="0"/>
+                <w:bCs w:val="false"/>
+                <w:i w:val="0"/>
+                <w:iCs w:val="false"/>
+                <w:sz w:val="21"/>
+                <w:szCs w:val="20"/>
+              </w:rPr>
+              <w:t>No evidence of spatial autocorrelation</w:t>
+            </w:r>
+          </w:p>
+        </w:tc>
+      </w:tr>
+      <w:tr>
+        <w:tc>
+          <w:tcPr>
+            <w:tcW w:type="dxa" w:w="1800"/>
+            <w:tcMar>
+              <w:top w:type="dxa" w:w="80"/>
+              <w:left w:type="dxa" w:w="100"/>
+              <w:bottom w:type="dxa" w:w="80"/>
+              <w:right w:type="dxa" w:w="100"/>
+            </w:tcMar>
+            <w:vAlign w:val="center"/>
+          </w:tcPr>
+          <w:p>
+            <w:pPr>
+              <w:jc w:val="center"/>
+            </w:pPr>
+            <w:r>
+              <w:rPr>
+                <w:rFonts w:ascii="Times New Roman" w:cs="Times New Roman" w:eastAsia="Times New Roman" w:hAnsi="Times New Roman"/>
+                <w:b w:val="0"/>
+                <w:bCs w:val="false"/>
+                <w:i w:val="0"/>
+                <w:iCs w:val="false"/>
+                <w:sz w:val="21"/>
+                <w:szCs w:val="20"/>
+              </w:rPr>
+              <w:t>Hausman test (FE vs. RE)</w:t>
+              <w:br/>
+              <w:t>(Swamy-Arora RE estimator)</w:t>
+            </w:r>
+          </w:p>
+        </w:tc>
+        <w:tc>
+          <w:tcPr>
+            <w:tcW w:type="dxa" w:w="2600"/>
+            <w:tcMar>
+              <w:top w:type="dxa" w:w="80"/>
+              <w:left w:type="dxa" w:w="100"/>
+              <w:bottom w:type="dxa" w:w="80"/>
+              <w:right w:type="dxa" w:w="100"/>
+            </w:tcMar>
+            <w:vAlign w:val="center"/>
+          </w:tcPr>
+          <w:p>
+            <w:pPr>
+              <w:jc w:val="center"/>
+            </w:pPr>
+            <w:r>
+              <w:rPr>
+                <w:rFonts w:ascii="Times New Roman" w:cs="Times New Roman" w:eastAsia="Times New Roman" w:hAnsi="Times New Roman"/>
+                <w:b w:val="0"/>
+                <w:bCs w:val="false"/>
+                <w:i w:val="0"/>
+                <w:iCs w:val="false"/>
+                <w:sz w:val="21"/>
+                <w:szCs w:val="20"/>
+              </w:rPr>
+              <w:t>Whether FE is preferred over the more efficient RE estimator</w:t>
+            </w:r>
+          </w:p>
+        </w:tc>
+        <w:tc>
+          <w:tcPr>
+            <w:tcW w:type="dxa" w:w="3100"/>
+            <w:tcMar>
+              <w:top w:type="dxa" w:w="80"/>
+              <w:left w:type="dxa" w:w="100"/>
+              <w:bottom w:type="dxa" w:w="80"/>
+              <w:right w:type="dxa" w:w="100"/>
+            </w:tcMar>
+            <w:vAlign w:val="center"/>
+          </w:tcPr>
+          <w:p>
+            <w:pPr>
+              <w:jc w:val="center"/>
+            </w:pPr>
+            <w:r>
+              <w:rPr>
+                <w:rFonts w:ascii="Times New Roman" w:cs="Times New Roman" w:eastAsia="Times New Roman" w:hAnsi="Times New Roman"/>
+                <w:b w:val="0"/>
+                <w:bCs w:val="false"/>
+                <w:i w:val="0"/>
+                <w:iCs w:val="false"/>
+                <w:sz w:val="21"/>
+                <w:szCs w:val="20"/>
+              </w:rPr>
+              <w:t>Classical statistic not computable (finite-sample degeneracy, θ = 0.978); RE point estimate (β = −2.126) diverges from FE by 17%, moving toward the confounded pooled r = +0.887</w:t>
+            </w:r>
+          </w:p>
+        </w:tc>
+        <w:tc>
+          <w:tcPr>
+            <w:tcW w:type="dxa" w:w="1850"/>
+            <w:tcMar>
+              <w:top w:type="dxa" w:w="80"/>
+              <w:left w:type="dxa" w:w="100"/>
+              <w:bottom w:type="dxa" w:w="80"/>
+              <w:right w:type="dxa" w:w="100"/>
+            </w:tcMar>
+            <w:vAlign w:val="center"/>
+          </w:tcPr>
+          <w:p>
+            <w:pPr>
+              <w:jc w:val="center"/>
+            </w:pPr>
+            <w:r>
+              <w:rPr>
+                <w:rFonts w:ascii="Times New Roman" w:cs="Times New Roman" w:eastAsia="Times New Roman" w:hAnsi="Times New Roman"/>
+                <w:b w:val="0"/>
+                <w:bCs w:val="false"/>
+                <w:i w:val="0"/>
+                <w:iCs w:val="false"/>
+                <w:sz w:val="21"/>
+                <w:szCs w:val="20"/>
+              </w:rPr>
+              <w:t>Not formally testable; divergence supports retaining FE</w:t>
+            </w:r>
+          </w:p>
+        </w:tc>
+      </w:tr>
+      <w:tr>
+        <w:tc>
+          <w:tcPr>
+            <w:tcW w:type="dxa" w:w="1800"/>
+            <w:tcMar>
+              <w:top w:type="dxa" w:w="80"/>
+              <w:left w:type="dxa" w:w="100"/>
+              <w:bottom w:type="dxa" w:w="80"/>
+              <w:right w:type="dxa" w:w="100"/>
+            </w:tcMar>
+            <w:vAlign w:val="center"/>
+          </w:tcPr>
+          <w:p>
+            <w:pPr>
+              <w:jc w:val="center"/>
+            </w:pPr>
+            <w:r>
+              <w:rPr>
+                <w:rFonts w:ascii="Times New Roman" w:cs="Times New Roman" w:eastAsia="Times New Roman" w:hAnsi="Times New Roman"/>
+                <w:b w:val="0"/>
+                <w:bCs w:val="false"/>
+                <w:i w:val="0"/>
+                <w:iCs w:val="false"/>
+                <w:sz w:val="21"/>
+                <w:szCs w:val="20"/>
+              </w:rPr>
+              <w:t>Minimum detectable effect</w:t>
+              <w:br/>
+              <w:t>(MDE; Bloom, 1995)</w:t>
+            </w:r>
+          </w:p>
+        </w:tc>
+        <w:tc>
+          <w:tcPr>
+            <w:tcW w:type="dxa" w:w="2600"/>
+            <w:tcMar>
+              <w:top w:type="dxa" w:w="80"/>
+              <w:left w:type="dxa" w:w="100"/>
+              <w:bottom w:type="dxa" w:w="80"/>
+              <w:right w:type="dxa" w:w="100"/>
+            </w:tcMar>
+            <w:vAlign w:val="center"/>
+          </w:tcPr>
+          <w:p>
+            <w:pPr>
+              <w:jc w:val="center"/>
+            </w:pPr>
+            <w:r>
+              <w:rPr>
+                <w:rFonts w:ascii="Times New Roman" w:cs="Times New Roman" w:eastAsia="Times New Roman" w:hAnsi="Times New Roman"/>
+                <w:b w:val="0"/>
+                <w:bCs w:val="false"/>
+                <w:i w:val="0"/>
+                <w:iCs w:val="false"/>
+                <w:sz w:val="21"/>
+                <w:szCs w:val="20"/>
+              </w:rPr>
+              <w:t>Statistical power of the design at conventional thresholds</w:t>
+            </w:r>
+          </w:p>
+        </w:tc>
+        <w:tc>
+          <w:tcPr>
+            <w:tcW w:type="dxa" w:w="3100"/>
+            <w:tcMar>
+              <w:top w:type="dxa" w:w="80"/>
+              <w:left w:type="dxa" w:w="100"/>
+              <w:bottom w:type="dxa" w:w="80"/>
+              <w:right w:type="dxa" w:w="100"/>
+            </w:tcMar>
+            <w:vAlign w:val="center"/>
+          </w:tcPr>
+          <w:p>
+            <w:pPr>
+              <w:jc w:val="center"/>
+            </w:pPr>
+            <w:r>
+              <w:rPr>
+                <w:rFonts w:ascii="Times New Roman" w:cs="Times New Roman" w:eastAsia="Times New Roman" w:hAnsi="Times New Roman"/>
+                <w:b w:val="0"/>
+                <w:bCs w:val="false"/>
+                <w:i w:val="0"/>
+                <w:iCs w:val="false"/>
+                <w:sz w:val="21"/>
+                <w:szCs w:val="20"/>
+              </w:rPr>
+              <w:t>MDE = 2.33 at 80% power (91% of observed |β| = 2.554); MDE = 2.69 at 90% power (exceeds observed |β|)</w:t>
+            </w:r>
+          </w:p>
+        </w:tc>
+        <w:tc>
+          <w:tcPr>
+            <w:tcW w:type="dxa" w:w="1850"/>
+            <w:tcMar>
+              <w:top w:type="dxa" w:w="80"/>
+              <w:left w:type="dxa" w:w="100"/>
+              <w:bottom w:type="dxa" w:w="80"/>
+              <w:right w:type="dxa" w:w="100"/>
+            </w:tcMar>
+            <w:vAlign w:val="center"/>
+          </w:tcPr>
+          <w:p>
+            <w:pPr>
+              <w:jc w:val="center"/>
+            </w:pPr>
+            <w:r>
+              <w:rPr>
+                <w:rFonts w:ascii="Times New Roman" w:cs="Times New Roman" w:eastAsia="Times New Roman" w:hAnsi="Times New Roman"/>
+                <w:b w:val="0"/>
+                <w:bCs w:val="false"/>
+                <w:i w:val="0"/>
+                <w:iCs w:val="false"/>
+                <w:sz w:val="21"/>
+                <w:szCs w:val="20"/>
+              </w:rPr>
+              <w:t>Adequately but not comfortably powered</w:t>
+            </w:r>
+          </w:p>
+        </w:tc>
+      </w:tr>
+    </w:tbl>
+    <w:p>
+      <w:pPr>
         <w:spacing w:after="120" w:before="220"/>
       </w:pPr>
       <w:r>
@@ -2757,12 +3769,12 @@
           <w:sz w:val="22"/>
           <w:szCs w:val="22"/>
         </w:rPr>
-        <w:t xml:space="preserve">Robustness Check: Permutation Test</w:t>
-      </w:r>
-    </w:p>
-    <w:p>
-      <w:pPr>
-        <w:spacing w:after="160" w:line="276"/>
+        <w:t xml:space="preserve">Robustness Check: First Differences</w:t>
+      </w:r>
+    </w:p>
+    <w:p>
+      <w:pPr>
+        <w:spacing w:after="160" w:line="360"/>
         <w:jc w:val="both"/>
       </w:pPr>
       <w:r>
@@ -2775,41 +3787,6 @@
           <w:sz w:val="22"/>
           <w:szCs w:val="22"/>
         </w:rPr>
-        <w:t xml:space="preserve">Because standard cluster-robust standard errors can be unreliable with a small number of clusters (here, 17 regions) (Cameron &amp; Miller, 2015), we additionally validated the primary fixed-effects estimate using two nonparametric permutation tests (5,000 iterations each, seed=42). A full label-permutation test, randomly reassigning PM2.5 series across regions, yielded an empirical p-value of 0.0048. A more conservative block-permutation test, circularly time-shifting each region’s own PM2.5 series while preserving its trend shape, yielded p = 0.0008. Both approaches confirm that the observed coefficient (β = −2.554) is a highly unlikely draw under the null hypothesis of no region-specific PM2.5–asthma relationship, supporting the robustness of the clustered-SE result despite the modest number of clusters.</w:t>
-      </w:r>
-    </w:p>
-    <w:p>
-      <w:pPr>
-        <w:spacing w:after="120" w:before="220"/>
-      </w:pPr>
-      <w:r>
-        <w:rPr>
-          <w:rFonts w:ascii="Times New Roman" w:cs="Times New Roman" w:eastAsia="Times New Roman" w:hAnsi="Times New Roman"/>
-          <w:b/>
-          <w:bCs/>
-          <w:i w:val="false"/>
-          <w:iCs w:val="false"/>
-          <w:sz w:val="22"/>
-          <w:szCs w:val="22"/>
-        </w:rPr>
-        <w:t xml:space="preserve">Robustness Check: First Differences</w:t>
-      </w:r>
-    </w:p>
-    <w:p>
-      <w:pPr>
-        <w:spacing w:after="160" w:line="276"/>
-        <w:jc w:val="both"/>
-      </w:pPr>
-      <w:r>
-        <w:rPr>
-          <w:rFonts w:ascii="Times New Roman" w:cs="Times New Roman" w:eastAsia="Times New Roman" w:hAnsi="Times New Roman"/>
-          <w:b w:val="false"/>
-          <w:bCs w:val="false"/>
-          <w:i w:val="false"/>
-          <w:iCs w:val="false"/>
-          <w:sz w:val="22"/>
-          <w:szCs w:val="22"/>
-        </w:rPr>
         <w:t xml:space="preserve">The first-differences analysis — year-over-year changes in PM2.5 correlated with year-over-year changes in asthma prevalence within each region — yielded Pearson r = +0.199 (p = 0.014, n = 153). This weak positive correlation is in the expected biological direction but confirms no strong within-region temporal association. Figure 5 presents the within-region correlation for each of the 17 individual regions as a forest plot.</w:t>
       </w:r>
     </w:p>
@@ -2821,7 +3798,7 @@
       <w:r>
         <w:drawing>
           <wp:inline distT="0" distB="0" distL="0" distR="0">
-            <wp:extent cx="5334000" cy="3295650"/>
+            <wp:extent cx="4533900" cy="2801303"/>
             <wp:effectExtent t="0" r="0" b="0" l="0"/>
             <wp:docPr id="1" name="" descr="" title=""/>
             <wp:cNvGraphicFramePr>
@@ -2846,7 +3823,7 @@
                   <pic:spPr bwMode="auto">
                     <a:xfrm>
                       <a:off x="0" y="0"/>
-                      <a:ext cx="5334000" cy="3295650"/>
+                      <a:ext cx="4533900" cy="2801303"/>
                     </a:xfrm>
                     <a:prstGeom prst="rect">
                       <a:avLst/>
@@ -2861,7 +3838,7 @@
     </w:p>
     <w:p>
       <w:pPr>
-        <w:spacing w:after="240" w:line="276"/>
+        <w:spacing w:after="240" w:line="360"/>
         <w:jc w:val="both"/>
       </w:pPr>
       <w:r>
@@ -2887,64 +3864,6 @@
           <w:szCs w:val="20"/>
         </w:rPr>
         <w:t xml:space="preserve">Forest plot of within-region Pearson correlation between annual PM2.5 and pediatric asthma prevalence for each of the 17 Philippine administrative regions, 2013–2022. Points show the Pearson r for each region; horizontal bars represent approximate 95% confidence intervals. The dashed vertical line marks r = 0; dotted lines mark the first-differences pooled r (0.199) and the pooled cross-sectional r (0.887). Wide confidence intervals and mixed signs across regions indicate no consistent within-region association.</w:t>
-      </w:r>
-    </w:p>
-    <w:p>
-      <w:pPr>
-        <w:spacing w:before="220" w:after="120"/>
-      </w:pPr>
-      <w:r>
-        <w:rPr>
-          <w:rFonts w:ascii="Times New Roman" w:hAnsi="Times New Roman"/>
-          <w:b/>
-          <w:i w:val="0"/>
-          <w:sz w:val="22"/>
-        </w:rPr>
-        <w:t>Robustness Check: Wild Cluster Bootstrap</w:t>
-      </w:r>
-    </w:p>
-    <w:p>
-      <w:pPr>
-        <w:spacing w:after="160"/>
-        <w:jc w:val="both"/>
-      </w:pPr>
-      <w:r>
-        <w:rPr>
-          <w:rFonts w:ascii="Times New Roman" w:hAnsi="Times New Roman"/>
-          <w:b w:val="0"/>
-          <w:i w:val="0"/>
-          <w:sz w:val="22"/>
-        </w:rPr>
-        <w:t>Because the label- and block-permutation tests above are one nonparametric approach to small-cluster inference, we additionally validated the primary coefficient with a second, methodologically distinct method: the wild cluster bootstrap, restricted version (WCR; Cameron, Gelbach &amp; Miller, 2008; MacKinnon, Nielsen &amp; Webb, 2023), one of the most widely recommended small-G inference procedures in applied panel econometrics. Under the null hypothesis β = 0, we resampled the model’s own restricted residuals with region-level Rademacher sign flips (5,000 replications, seed = 42) and re-estimated the two-way fixed-effects coefficient each time, comparing the resulting bootstrap t-distribution to the actually observed t-statistic (t = −3.10). The WCR bootstrap p-value was p = 0.036 — still below the conventional 0.05 threshold, but a meaningfully weaker result than the clustered-SE p-value (p = 0.0024) or either permutation-test p-value (p = 0.0048 and p = 0.0008). This pattern — significance that survives but with much less margin under small-cluster-robust bootstrap inference — is consistent with the caution already noted in this manuscript about the modest number of clusters (17 regions) underlying the clustered standard errors.</w:t>
-      </w:r>
-    </w:p>
-    <w:p>
-      <w:pPr>
-        <w:spacing w:before="220" w:after="120"/>
-      </w:pPr>
-      <w:r>
-        <w:rPr>
-          <w:rFonts w:ascii="Times New Roman" w:hAnsi="Times New Roman"/>
-          <w:b/>
-          <w:i w:val="0"/>
-          <w:sz w:val="22"/>
-        </w:rPr>
-        <w:t>Robustness Check: Leave-One-Region-Out Jackknife</w:t>
-      </w:r>
-    </w:p>
-    <w:p>
-      <w:pPr>
-        <w:spacing w:after="160"/>
-        <w:jc w:val="both"/>
-      </w:pPr>
-      <w:r>
-        <w:rPr>
-          <w:rFonts w:ascii="Times New Roman" w:hAnsi="Times New Roman"/>
-          <w:b w:val="0"/>
-          <w:i w:val="0"/>
-          <w:sz w:val="22"/>
-        </w:rPr>
-        <w:t>To confirm the primary coefficient was not being driven by any single region — a natural concern given that the National Capital Region (NCR) is a clear outlier in levels (Figure 1; highest PM2.5 and highest asthma prevalence in the country) — we re-estimated the two-way fixed-effects model 17 times, each time dropping one region and refitting on the remaining 16 regions × 10 years (n = 160). The coefficient remained negative in all 17 refits (range: β = −1.416 to β = −2.812) and remained statistically significant (p &lt; 0.05) in all 17 refits. The result was not uniform, however: dropping NCR specifically produced the smallest-magnitude, least precise estimate of the 17 (β = −1.416, SE = 0.699, p = 0.045) — a 45% reduction in magnitude relative to the full-sample β = −2.554, and the only refit with p above 0.03. Figure 7 shows all 17 estimates. NCR is therefore a meaningful, though not sole, contributor to the primary result’s magnitude and precision: the negative within-region association holds without NCR, but is markedly weaker.</w:t>
       </w:r>
     </w:p>
     <w:p>
@@ -3065,7 +3984,7 @@
           <w:i w:val="0"/>
           <w:sz w:val="22"/>
         </w:rPr>
-        <w:t>The Discussion below argues that asthma prevalence, as a slowly changing “stock” measure, may be poorly suited to detecting a same-year PM2.5 effect, and that cumulative exposure is more biologically plausible than a single year’s mean concentration. We tested this directly by re-estimating the two-way fixed-effects model with PM2.5 lagged 1, 2, and 3 years, and with a 3-year trailing rolling-mean PM2.5 exposure, each on the correspondingly smaller (but still balanced) rectangular panel. The 1- and 2-year lag specifications produced similar-magnitude, still-negative coefficients (β = −2.156, p = 0.004, n = 153; β = −2.168, p = 0.054, n = 136); the 3-year lag attenuated further and lost significance (β = −1.627, p = 0.151, n = 119). The 3-year rolling-mean specification, by contrast, produced a substantially larger and more precisely estimated negative coefficient than the same-year model (β = −6.040, SE = 1.110, p &lt; 0.0001, within-R² = 0.204, n = 136) — the strongest result, in either direction, of any specification examined in this manuscript. Figure 8 compares all five specifications. This is an important and unexpected finding that should be read carefully: a stronger negative within-region association under cumulative exposure does not support a protective effect of PM2.5, for the same reason stated throughout this manuscript — the negative sign reflects the absence of a positive signal in a dataset where asthma prevalence is nearly time-invariant within regions, not evidence that PM2.5 reduces asthma. What it does show is that the null/negative result is not an artifact specific to same-year exposure timing; if anything, a more biologically plausible cumulative-exposure specification strengthens the finding of no detectable positive within-region PM2.5–asthma association in this dataset.</w:t>
+        <w:t>The Discussion below argues that asthma prevalence, as a slowly changing “stock” measure, may be poorly suited to detecting a same-year PM2.5 effect, and that cumulative exposure is more biologically plausible than a single year’s mean concentration. We tested this directly by re-estimating the two-way fixed-effects model with PM2.5 lagged 1, 2, and 3 years, and with a 3-year trailing rolling-mean exposure, each on the correspondingly smaller (but still balanced) panel. These four specifications were not pre-specified individually; they are treated as an exploratory family distinct from the same-year primary specification, with p-values reported both raw and after a Holm-Bonferroni correction (Holm, 1979) across the 4 tests. The 1- and 2-year lags produced similar-magnitude, still-negative coefficients (β = −2.156, raw p = 0.004, Holm-adjusted p = 0.012, n = 153; β = −2.168, raw p = 0.054, Holm-adjusted p = 0.107, n = 136); the 3-year lag attenuated further and lost significance even before correction (β = −1.627, raw p = 0.151, Holm-adjusted p = 0.151, n = 119). The 3-year rolling mean, by contrast, produced a substantially larger and more precisely estimated coefficient than the same-year model (β = −6.040, SE = 1.110, raw p &lt; 0.0001, Holm-adjusted p &lt; 0.0001, within-R² = 0.204, n = 136) — the strongest result of any specification in this manuscript, and the only one of the four not remotely in question after correction (Figure 8). This should be read carefully: a stronger negative association under cumulative exposure does not support a protective effect of PM2.5 — the negative sign reflects the absence of a positive signal in a dataset where asthma prevalence is nearly time-invariant within regions, not evidence that PM2.5 reduces it. What it does show is that the null/negative result is not an artifact of same-year timing or of testing several lags and reporting the best one: the 1-year lag and the 3-year rolling mean both survive correction, while only the weaker 2- and 3-year lags do not.</w:t>
       </w:r>
     </w:p>
     <w:p>
@@ -3119,7 +4038,7 @@
           <w:i/>
           <w:sz w:val="20"/>
         </w:rPr>
-        <w:t xml:space="preserve">Figure 8. </w:t>
+        <w:t>Figure 8. Two-way fixed-effects β under alternative PM2.5 exposure timing: same-year (primary spec), 1/2/3-year lags, and a 3-year trailing rolling mean. Points show β; horizontal bars show 95% confidence intervals (clustered SE). All specifications remain negative; the 3-year rolling mean produces the largest-magnitude, most precisely estimated coefficient of any specification in this manuscript (β = −6.040, raw p &lt; 0.0001, Holm-adjusted p &lt; 0.0001 across the 4-specification exploratory family; see text).</w:t>
       </w:r>
       <w:r>
         <w:rPr>
@@ -3128,7 +4047,6 @@
           <w:i/>
           <w:sz w:val="20"/>
         </w:rPr>
-        <w:t>Two-way fixed-effects β under alternative PM2.5 exposure timing: same-year (primary spec), 1/2/3-year lags, and a 3-year trailing rolling mean. Points show β; horizontal bars show 95% confidence intervals (clustered SE). All specifications remain negative; the 3-year rolling mean produces the largest-magnitude, most precisely estimated coefficient of any specification in this manuscript (β = −6.040, p &lt; 0.0001).</w:t>
       </w:r>
     </w:p>
     <w:p>
@@ -3142,7 +4060,7 @@
           <w:i w:val="0"/>
           <w:sz w:val="22"/>
         </w:rPr>
-        <w:t>Specification Test: Fixed Effects versus Random Effects (Hausman Test)</w:t>
+        <w:t>Robustness Check: Placebo Outcome</w:t>
       </w:r>
     </w:p>
     <w:p>
@@ -3157,94 +4075,7 @@
           <w:i w:val="0"/>
           <w:sz w:val="22"/>
         </w:rPr>
-        <w:t>This manuscript’s Methods section states that the two-way fixed-effects model was chosen because it controls for stable regional differences, without a formal test of that choice against a random-effects (RE) alternative, which would be more efficient if region effects were uncorrelated with PM2.5 — an assumption this manuscript’s own Discussion argues is false (regions with structurally higher PM2.5 also have structurally higher urbanization and diagnostic capacity). We fit a Swamy-Arora random-effects estimator (Swamy &amp; Arora, 1972) on the same regressor set (PM2.5 plus year dummies) and compared it to the fixed-effects estimate via a Hausman specification test (Hausman, 1978; Wooldridge, 2010). The classical Hausman chi-square statistic was not reliably computable in this dataset: the estimated variance difference Var(β_FE) − Var(β_RE) was negative under both the two-way specification and a simpler one-way (region-only) specification, a known finite-sample degeneracy of the classical Hausman test that can occur when the random-effects estimator’s theoretical efficiency gain over fixed effects is small (here, the RE quasi-demeaning weight θ = 0.978, i.e. the RE transform is already close to a full within-transform because between-region variance in this dataset is very large relative to within-region variance). A valid Hausman p-value therefore cannot be reported. What can be reported directly: the RE point estimate (β = −2.126) differs from the FE point estimate (β = −2.554) by seventeen percent, moving toward the strongly positive pooled correlation (r = +0.887) that this manuscript’s central argument attributes to between-region confounding — exactly the direction RE contamination would be expected to move the estimate if that confounding is real. Combined with the qualitative argument already made in the Discussion, this supports retaining fixed effects as the primary specification even without a formally significant test statistic.</w:t>
-      </w:r>
-    </w:p>
-    <w:p>
-      <w:pPr>
-        <w:spacing w:before="220" w:after="120"/>
-      </w:pPr>
-      <w:r>
-        <w:rPr>
-          <w:rFonts w:ascii="Times New Roman" w:hAnsi="Times New Roman"/>
-          <w:b/>
-          <w:i w:val="0"/>
-          <w:sz w:val="22"/>
-        </w:rPr>
-        <w:t>Statistical Power: Minimum Detectable Effect</w:t>
-      </w:r>
-    </w:p>
-    <w:p>
-      <w:pPr>
-        <w:spacing w:after="160"/>
-        <w:jc w:val="both"/>
-      </w:pPr>
-      <w:r>
-        <w:rPr>
-          <w:rFonts w:ascii="Times New Roman" w:hAnsi="Times New Roman"/>
-          <w:b w:val="0"/>
-          <w:i w:val="0"/>
-          <w:sz w:val="22"/>
-        </w:rPr>
-        <w:t>To make the qualitative concern implicit in the low within-R² (= 0.080) explicit, we calculated the minimum detectable effect (MDE; Bloom, 1995) implied by the primary model’s clustered standard error (SE = 0.825, two-way FE residual df ≈ 143). At conventional thresholds (α = 0.05, 80% power), this design could reliably detect a true |β| of at least 2.33 asthma cases per 100,000 per 1 µg/m³ PM2.5 — 91% of the actually observed |β| = 2.554. In other words, this study had approximately 80% power to detect the effect size it in fact found, but a true effect smaller than roughly 2.3 units could plausibly go undetected altogether. At a stricter 90%-power standard, the MDE (2.69) exceeds the observed coefficient, meaning this design is only borderline-adequately powered even for the effect actually estimated. This should be read alongside, not instead of, the within-R² = 0.080 already reported: both describe the same underlying limitation — a panel with very little within-region temporal variance in the outcome — from different angles.</w:t>
-      </w:r>
-    </w:p>
-    <w:p>
-      <w:pPr>
-        <w:spacing w:before="220" w:after="120"/>
-      </w:pPr>
-      <w:r>
-        <w:rPr>
-          <w:rFonts w:ascii="Times New Roman" w:hAnsi="Times New Roman"/>
-          <w:b/>
-          <w:i w:val="0"/>
-          <w:sz w:val="22"/>
-        </w:rPr>
-        <w:t>Robustness Check: Spatial Autocorrelation of Residuals (Moran’s I)</w:t>
-      </w:r>
-    </w:p>
-    <w:p>
-      <w:pPr>
-        <w:spacing w:after="160"/>
-        <w:jc w:val="both"/>
-      </w:pPr>
-      <w:r>
-        <w:rPr>
-          <w:rFonts w:ascii="Times New Roman" w:hAnsi="Times New Roman"/>
-          <w:b w:val="0"/>
-          <w:i w:val="0"/>
-          <w:sz w:val="22"/>
-        </w:rPr>
-        <w:t>The clustered standard errors used throughout this manuscript assume residuals are uncorrelated across regions (only within-region correlation over time is accounted for). If two-way fixed-effects residuals were spatially clustered — for example, if neighboring regions shared unmodeled pollution sources or health-system characteristics — that assumption would be violated and the reported standard errors could understate true uncertainty. We tested this using Moran’s I (Moran, 1950) on the primary model’s residuals, averaged to one value per region. Because contiguity (“queen”/“rook”) adjacency is poorly suited to the Philippines’ archipelagic geography — many regions are island groups with no land border to any neighbor — spatial weights were instead built from real inter-region distances: province-level polygon centroids from the GADM shapefile already used elsewhere in this project for PM2.5 area-weighting were aggregated (area-weighted) to the 17 study regions, and a K-nearest-neighbor (k = 4) weight matrix was built from the resulting real great-circle distances. The observed Moran’s I was −0.0017, close to its expectation under no spatial autocorrelation (−0.063 for n = 17), and a spatial permutation test (5,000 reshuffles) gave p = 0.994 (two-sided). We find no evidence of residual spatial autocorrelation, supporting the validity of region-clustered (rather than spatially adjusted) standard errors for this dataset. This tests only global spatial autocorrelation; local indicators of spatial association (LISA; Anselin, 1995), which could identify whether any individual region drives a spatial pattern the global statistic would miss, were not computed, since the global result gave no overall signal to localize.</w:t>
-      </w:r>
-    </w:p>
-    <w:p>
-      <w:pPr>
-        <w:spacing w:before="220" w:after="120"/>
-      </w:pPr>
-      <w:r>
-        <w:rPr>
-          <w:rFonts w:ascii="Times New Roman" w:hAnsi="Times New Roman"/>
-          <w:b/>
-          <w:i w:val="0"/>
-          <w:sz w:val="22"/>
-        </w:rPr>
-        <w:t>Robustness Check: Placebo Outcome</w:t>
-      </w:r>
-    </w:p>
-    <w:p>
-      <w:pPr>
-        <w:spacing w:after="160"/>
-        <w:jc w:val="both"/>
-      </w:pPr>
-      <w:r>
-        <w:rPr>
-          <w:rFonts w:ascii="Times New Roman" w:hAnsi="Times New Roman"/>
-          <w:b w:val="0"/>
-          <w:i w:val="0"/>
-          <w:sz w:val="22"/>
-        </w:rPr>
-        <w:t>The multi-outcome analysis above (Table 4, Figure 6) tests generalizability across four additional respiratory-related outcomes, but all five outcomes examined so far (asthma plus the four in Table 4) share at least a plausible PM2.5 pathway. A stronger test of whether the primary null reflects a real absence of a same-year effect — rather than an artifact of how GBD subnational estimates are constructed, or of the two-way fixed-effects estimator itself — is a true negative control: an outcome with no plausible PM2.5 pathway at all (Lipsitch, Tchetgen Tchetgen &amp; Cohen, 2010). We obtained GBD 2023 prevalence data for low back pain (ages 5–14, the same subnational province-level export filters used for the other outcomes) and confirmed non-degenerate variance across provinces and years before proceeding: mean prevalence was 773.0 ± 14.7 per 100,000, no province-year value was zero or duplicated, and every one of the 82 provinces showed genuine year-to-year variation (within-province SD ranging 3.3 to 14.5), ruling out a flat or degenerate series. Applying the identical two-way fixed-effects specification (region and year effects, standard errors clustered by region) used throughout this manuscript, PM2.5 showed no statistically significant association with low back pain prevalence (β = −0.180, SE = 0.414, p = 0.664, within-R² = 0.003, n = 170). This null result on a genuinely implausible outcome supports interpreting the primary asthma null as a real absence of a detectable same-year, within-region PM2.5 effect, rather than as an artifact of the GBD subnational estimation pipeline or of the fixed-effects estimator producing spurious associations generally.</w:t>
+        <w:t>The multi-outcome analysis below (Table 6, Figure 6) tests generalizability across four additional respiratory-related outcomes, but all five outcomes examined so far (asthma plus the four in Table 6) share at least a plausible PM2.5 pathway. A stronger test of whether the primary null reflects a real absence of a same-year effect — rather than an artifact of how GBD subnational estimates are constructed, or of the two-way fixed-effects estimator itself — is a true negative control: an outcome with no plausible PM2.5 pathway at all (Lipsitch, Tchetgen Tchetgen &amp; Cohen, 2010). We obtained GBD 2023 prevalence data for low back pain (ages 5–14, the same subnational province-level export filters used for the other outcomes) and confirmed non-degenerate variance across provinces and years before proceeding: mean prevalence was 773.0 ± 14.7 per 100,000, no province-year value was zero or duplicated, and every one of the 82 provinces showed genuine year-to-year variation (within-province SD ranging 3.3 to 14.5), ruling out a flat or degenerate series. Applying the identical two-way fixed-effects specification (region and year effects, standard errors clustered by region) used throughout this manuscript, PM2.5 showed no statistically significant association with low back pain prevalence (β = −0.180, SE = 0.414, p = 0.664, within-R² = 0.003, n = 170). This null result on a genuinely implausible outcome supports interpreting the primary asthma null as a real absence of a detectable same-year, within-region PM2.5 effect, rather than as an artifact of the GBD subnational estimation pipeline or of the fixed-effects estimator producing spurious associations generally.</w:t>
       </w:r>
     </w:p>
     <w:p>
@@ -3298,7 +4129,7 @@
           <w:i/>
           <w:sz w:val="20"/>
         </w:rPr>
-        <w:t xml:space="preserve">Figure 10. </w:t>
+        <w:t xml:space="preserve">Figure 9. </w:t>
       </w:r>
       <w:r>
         <w:rPr>
@@ -3329,7 +4160,7 @@
     </w:p>
     <w:p>
       <w:pPr>
-        <w:spacing w:after="160" w:line="276"/>
+        <w:spacing w:after="160" w:line="360"/>
         <w:jc w:val="both"/>
       </w:pPr>
       <w:r>
@@ -3364,7 +4195,7 @@
     </w:p>
     <w:p>
       <w:pPr>
-        <w:spacing w:after="160" w:line="276"/>
+        <w:spacing w:after="160" w:line="360"/>
         <w:jc w:val="both"/>
       </w:pPr>
       <w:r>
@@ -3377,12 +4208,12 @@
           <w:sz w:val="22"/>
           <w:szCs w:val="22"/>
         </w:rPr>
-        <w:t xml:space="preserve">The pooled correlation is dominated by a simple structural reality: regions with higher PM2.5 are also more urbanized, wealthier, and better served by healthcare systems. The National Capital Region is the clearest example: highest PM2.5 in the country at 26.74 µg/m³, and also highest recorded asthma prevalence. But this is not only because pollution drives asthma diagnoses in NCR — it is also because NCR has the most hospitals, the most pediatricians, the most diagnostic infrastructure, and the most complete health reporting of any Philippine region. A child in NCR with asthma is far more likely to receive a formal diagnosis than a child in rural Eastern Visayas, even if their underlying disease burden is similar.</w:t>
-      </w:r>
-    </w:p>
-    <w:p>
-      <w:pPr>
-        <w:spacing w:after="160" w:line="276"/>
+        <w:t xml:space="preserve">The pooled correlation is dominated by a simple structural reality: regions with higher PM2.5 are also more urbanized, wealthier, and better served by healthcare systems. The National Capital Region is the clearest example: highest PM2.5 in the country at 26.74 µg/m³, and also highest recorded asthma prevalence — driven not only by pollution but by NCR having the most hospitals, pediatricians, and diagnostic infrastructure of any Philippine region. A child in NCR with asthma is far more likely to receive a formal diagnosis than a child in rural Eastern Visayas, even if their underlying disease burden is similar.</w:t>
+      </w:r>
+    </w:p>
+    <w:p>
+      <w:pPr>
+        <w:spacing w:after="160" w:line="360"/>
         <w:jc w:val="both"/>
       </w:pPr>
       <w:r>
@@ -3395,7 +4226,7 @@
           <w:sz w:val="22"/>
           <w:szCs w:val="22"/>
         </w:rPr>
-        <w:t xml:space="preserve">When a region’s PM2.5 changes from one year to the next, does its asthma prevalence move in the same direction? This phenomenon — where an apparent association reflects differential diagnostic capacity rather than a true biological effect — is one of the most important and commonly mishandled problems in ecological epidemiology. The fixed-effects model directly addresses it by removing all stable regional differences, leaving only the year-to-year variation in PM2.5 within each region. The answer from this dataset: not robustly.</w:t>
+        <w:t xml:space="preserve">This is a textbook instance of aggregation bias — closely related to Simpson’s paradox and the ecological fallacy (Robinson, 1950) — in the specific form panel econometrics uses fixed effects to solve: a between-unit pattern driven by a stable confounder can reverse sign once that confounder is removed. What is novel here is less the reversal itself than its likely mechanism — diagnostic-capacity confounding, which most existing Philippine PM2.5-asthma literature does not appear to have tested for — and the fixed-effects model tests it directly, by asking whether a region’s asthma prevalence moves with its own PM2.5 from year to year once stable regional differences are removed. The answer from this dataset: not robustly.</w:t>
       </w:r>
     </w:p>
     <w:p>
@@ -3409,70 +4240,7 @@
           <w:i w:val="0"/>
           <w:sz w:val="22"/>
         </w:rPr>
-        <w:t>Confounding Structure and an Approximate E-Value</w:t>
-      </w:r>
-    </w:p>
-    <w:p>
-      <w:pPr>
-        <w:jc w:val="center"/>
-      </w:pPr>
-      <w:r>
-        <w:drawing>
-          <wp:inline xmlns:a="http://schemas.openxmlformats.org/drawingml/2006/main" xmlns:pic="http://schemas.openxmlformats.org/drawingml/2006/picture">
-            <wp:extent cx="5330952" cy="3850132"/>
-            <wp:docPr id="4" name="Picture 4"/>
-            <wp:cNvGraphicFramePr>
-              <a:graphicFrameLocks noChangeAspect="1"/>
-            </wp:cNvGraphicFramePr>
-            <a:graphic>
-              <a:graphicData uri="http://schemas.openxmlformats.org/drawingml/2006/picture">
-                <pic:pic>
-                  <pic:nvPicPr>
-                    <pic:cNvPr id="0" name="fig7_confounding_dag.png"/>
-                    <pic:cNvPicPr/>
-                  </pic:nvPicPr>
-                  <pic:blipFill>
-                    <a:blip r:embed="rId18"/>
-                    <a:stretch>
-                      <a:fillRect/>
-                    </a:stretch>
-                  </pic:blipFill>
-                  <pic:spPr>
-                    <a:xfrm>
-                      <a:off x="0" y="0"/>
-                      <a:ext cx="5330952" cy="3850132"/>
-                    </a:xfrm>
-                    <a:prstGeom prst="rect"/>
-                  </pic:spPr>
-                </pic:pic>
-              </a:graphicData>
-            </a:graphic>
-          </wp:inline>
-        </w:drawing>
-      </w:r>
-    </w:p>
-    <w:p>
-      <w:pPr>
-        <w:spacing w:after="240"/>
-        <w:jc w:val="both"/>
-      </w:pPr>
-      <w:r>
-        <w:rPr>
-          <w:rFonts w:ascii="Times New Roman" w:hAnsi="Times New Roman"/>
-          <w:b/>
-          <w:i/>
-          <w:sz w:val="20"/>
-        </w:rPr>
-        <w:t xml:space="preserve">Figure 9. </w:t>
-      </w:r>
-      <w:r>
-        <w:rPr>
-          <w:rFonts w:ascii="Times New Roman" w:hAnsi="Times New Roman"/>
-          <w:b w:val="0"/>
-          <w:i/>
-          <w:sz w:val="20"/>
-        </w:rPr>
-        <w:t>Directed acyclic graph of the hypothesized confounding structure. Blue: the path of interest (two-way fixed-effects estimate). Gray dashed: confounding paths closed by region and year fixed effects. Red: the one confounding path this design does not close (unobserved region × year-varying confounders), matching the Limitations section.</w:t>
+        <w:t>An Approximate E-Value for the Pooled Correlation</w:t>
       </w:r>
     </w:p>
     <w:p>
@@ -3487,7 +4255,21 @@
           <w:i w:val="0"/>
           <w:sz w:val="22"/>
         </w:rPr>
-        <w:t>Figure 9 lays out the argument made above as a directed acyclic graph (DAG; Greenland, Pearl &amp; Robins, 1999): region (time-invariant urbanization, healthcare infrastructure, and diagnostic capacity) and year (shared national trend) both plausibly affect PM2.5 and asthma prevalence, and both paths are closed by the two-way fixed-effects design; an unresolved path — unobserved region × year confounders such as local healthcare-access changes, smoking prevalence, or socioeconomic shifts within a region over time (already named in Limitations) — remains open. A formal d-separation check of this graph using dedicated software (e.g. the dagitty R package; Textor et al., 2016) was not performed here; the DAG above is a descriptive summary of the argument, not a software-verified causal model.</w:t>
+        <w:t>An E-value of ≈3.9 for the pooled correlation (r = +0.887; VanderWeele &amp; Ding, 2017; Haneuse, VanderWeele &amp; Arterburn, 2019) indicates a moderate, not extreme, bar for unmeasured confounding — consistent with, though not proof of, the region-level confounding already identified via fixed effects.</w:t>
+      </w:r>
+    </w:p>
+    <w:p>
+      <w:pPr>
+        <w:spacing w:before="220" w:after="120"/>
+      </w:pPr>
+      <w:r>
+        <w:rPr>
+          <w:rFonts w:ascii="Times New Roman" w:hAnsi="Times New Roman"/>
+          <w:b/>
+          <w:i w:val="0"/>
+          <w:sz w:val="22"/>
+        </w:rPr>
+        <w:t>Exploratory Check: A Confounder-Adjustment Sensitivity Test</w:t>
       </w:r>
     </w:p>
     <w:p>
@@ -3502,7 +4284,37 @@
           <w:i w:val="0"/>
           <w:sz w:val="22"/>
         </w:rPr>
-        <w:t>As a complementary, approximate quantification of how strong an unmeasured confounder would need to be, we calculated an E-value (VanderWeele &amp; Ding, 2017; Haneuse, VanderWeele &amp; Arterburn, 2019) for the pooled cross-sectional correlation (r = +0.887). The E-value framework is defined for risk ratios, not Pearson correlations, so this used VanderWeele &amp; Ding’s (2017) own stated approximation for a continuous, standardized effect size (their Table 2): RR ≈ exp(0.91 × d). For a bivariate relationship between two continuous, standardized variables, the standardized regression coefficient is the Pearson correlation itself (d = r = 0.887 here), so no further conversion (e.g. through an odds ratio) was needed. This gives RR ≈ 2.24 and an E-value ≈ 3.9: an unmeasured confounder would need to be associated with both PM2.5 and asthma prevalence by a risk ratio of at least roughly 3.9, above and beyond region and year, to fully explain away the pooled association on its own. This should be read as an approximation, not a precise bound — VanderWeele &amp; Ding note this conversion carries modest error for typical effect sizes and more for very large ones, and r = 0.887 is a very large one — and it is computed on the pooled/confounded correlation, not on the FE-adjusted null result (which has no correlation coefficient to convert). An E-value of this size is a moderate, not extreme, bar. It is consistent with — not evidence for — this manuscript’s central argument: region-level confounding (urbanization, diagnostic capacity) of roughly this magnitude is independently identified and adjusted for via fixed effects, which is exactly why the pooled association collapses under the two-way FE model.</w:t>
+        <w:t>As a direct empirical complement to the confounding argument and E-value bound above, indoor solid/biomass-fuel use for cooking — a plausible proxy for the region-level urbanization and socioeconomic differences already hypothesized to drive the pooled correlation — was added as a covariate to test its adjustment effect on the primary coefficient, not as a formal mediator in a causal-mediation sense. Region-level estimates were assembled from the three Philippine National Demographic and Health Survey (NDHS) rounds that overlap this study's window (2013, 2017, 2022; Philippine Statistics Authority &amp; ICF, 2014, 2023; Wang et al., 2020), the only years with a fuel-use module. The 2022 estimate is reported directly at the region level; the 2017 estimate is aggregated from 81 province-level estimates (Wang et al., 2020) using the same province-to-region mapping used elsewhere in this study; the 2013 survey published no region-level breakdown at all, so its regional values were instead constructed as a composite of the national urban (38.7%) and rural (81.1%) rates, weighted by each region's own urban/rural household share from the same survey's sampling frame — an approximation, not a direct measurement (see Limitations). The three anchor years were linearly interpolated to fill the remaining study years, without extrapolating beyond 2013 or 2022.</w:t>
+      </w:r>
+    </w:p>
+    <w:p>
+      <w:pPr>
+        <w:spacing w:after="160"/>
+        <w:jc w:val="both"/>
+      </w:pPr>
+      <w:r>
+        <w:rPr>
+          <w:rFonts w:ascii="Times New Roman" w:hAnsi="Times New Roman"/>
+          <w:b w:val="0"/>
+          <w:i w:val="0"/>
+          <w:sz w:val="22"/>
+        </w:rPr>
+        <w:t>Across the 17 regions, biomass-fuel-use correlates with PM2.5 at r = -0.73 (negative because urbanized, higher-outdoor-PM2.5 regions rely least on solid cooking fuel) — consistent with it proxying the regional structure discussed above. Adding it as a covariate to the primary two-way fixed-effects model moves the PM2.5 coefficient from β = -2.554 (p = 0.002) to β = -2.096 (p = 0.018), an 18% reduction; the biomass-fuel-use coefficient itself is not significant (β = 0.367, p = 0.168). This is consistent with biomass-fuel use sharing some of the region-level confounding already attributed to urbanization and diagnostic capacity, though the reduction falls well short of explaining the pooled-versus-within-region gap this study attributes to that confounding structure — and this covariate-adjustment result should not be read as evidence of a formal causal mediation pathway, which was not tested here.</w:t>
+      </w:r>
+    </w:p>
+    <w:p>
+      <w:pPr>
+        <w:spacing w:after="160"/>
+        <w:jc w:val="both"/>
+      </w:pPr>
+      <w:r>
+        <w:rPr>
+          <w:rFonts w:ascii="Times New Roman" w:hAnsi="Times New Roman"/>
+          <w:b w:val="0"/>
+          <w:i w:val="0"/>
+          <w:sz w:val="22"/>
+        </w:rPr>
+        <w:t>This result is not robust to the National Capital Region (NCR) alone: NCR already carries disproportionate weight in the primary result (dropping it widens the primary p-value from 0.002 to 0.045; see jackknife above), and its 2013 composite estimate is also the least reliable — NCR’s fully-urban household frame pins that value to the national urban rate (38.7%) alone, far above its real 2017 (4.0%) and 2022 (1.2%) survey values. Dropping NCR reduces the between-region correlation to r = -0.42 and makes the covariate-adjusted PM2.5 coefficient non-significant (p = 0.15). Given both this general NCR-sensitivity and the specific weakness in the 2013 estimate, this check is reported as exploratory and suggestive of a possible confound, not a confirmed finding.</w:t>
       </w:r>
     </w:p>
     <w:p>
@@ -3524,7 +4336,7 @@
     </w:p>
     <w:p>
       <w:pPr>
-        <w:spacing w:after="160" w:line="276"/>
+        <w:spacing w:after="160" w:line="360"/>
         <w:jc w:val="both"/>
       </w:pPr>
       <w:r>
@@ -3542,7 +4354,7 @@
     </w:p>
     <w:p>
       <w:pPr>
-        <w:spacing w:after="160" w:line="276"/>
+        <w:spacing w:after="160" w:line="360"/>
         <w:jc w:val="both"/>
       </w:pPr>
       <w:r>
@@ -3555,9 +4367,514 @@
           <w:sz w:val="22"/>
           <w:szCs w:val="22"/>
         </w:rPr>
-        <w:t xml:space="preserve">This reflects a fundamental feature of asthma prevalence as an outcome variable: it is a stock measure, representing the total accumulated number of people currently diagnosed with asthma, which changes slowly. Outcome variables that respond more directly to year-to-year environmental changes — lower respiratory infection incidence, acute respiratory emergency visits, hospital admission rates — would be far better suited for this type of panel analysis.</w:t>
-      </w:r>
-    </w:p>
+        <w:t>Whether this near-total between-region variance share reflects the epidemiology of asthma as a slowly accumulating chronic condition, or the smoothing inherent to GBD’s subnational estimation procedure more generally, is directly checkable using the placebo/negative-control outcome (low back pain) already used elsewhere in this study (Robustness Check: Placebo Outcome). Its own within-region variance share is 38.0% — 26 times higher than asthma’s 1.5% — and its between-region share (62.0%) is far below asthma’s (98.5%). Extending the comparison to the four other GBD-modeled outcomes examined in this study (Table 6) shows a clear gradient tracking disease acuity rather than a uniform floor: chronic, slowly-progressing conditions (asthma, 1.5% within-region; COPD, 2.0%) sit at one end, and acute, fast-changing conditions (lower respiratory infection incidence, 82.8%; respiratory mortality, 88.6%) sit at the other, with the placebo in between. If GBD’s subnational modeling suppressed within-region variance uniformly regardless of the specific cause being modeled, the placebo outcome should show a variance split similar to asthma’s; it does not. This argues against uniform smoothing as the explanation and supports the stock-measure interpretation above, though it does not fully rule out the possibility that GBD’s own spatiotemporal modeling incorporates disease-course priors that themselves encode this same acuity gradient. Under either interpretation, outcome variables with higher-frequency signal — lower respiratory infection incidence, emergency-department visits, hospital admission rates — would better suit a panel of this length.</w:t>
+      </w:r>
+    </w:p>
+    <w:p>
+      <w:pPr>
+        <w:spacing w:before="120" w:after="80"/>
+      </w:pPr>
+      <w:r>
+        <w:rPr>
+          <w:rFonts w:ascii="Times New Roman" w:hAnsi="Times New Roman"/>
+          <w:b/>
+          <w:i/>
+          <w:sz w:val="21"/>
+        </w:rPr>
+        <w:t>Table 5. Within- and between-region variance share across six GBD-modeled outcomes, Philippines 2013–2022:</w:t>
+      </w:r>
+    </w:p>
+    <w:tbl>
+      <w:tblPr>
+        <w:tblW w:type="dxa" w:w="9350"/>
+        <w:tblBorders>
+          <w:top w:val="single" w:color="000000" w:sz="4"/>
+          <w:left w:val="none"/>
+          <w:bottom w:val="single" w:color="000000" w:sz="4"/>
+          <w:right w:val="none"/>
+          <w:insideH w:val="single" w:color="999999" w:sz="2"/>
+          <w:insideV w:val="none"/>
+        </w:tblBorders>
+      </w:tblPr>
+      <w:tblGrid>
+        <w:gridCol w:w="4675"/>
+        <w:gridCol w:w="2338"/>
+        <w:gridCol w:w="2338"/>
+      </w:tblGrid>
+      <w:tr>
+        <w:trPr>
+          <w:tblHeader/>
+        </w:trPr>
+        <w:tc>
+          <w:tcPr>
+            <w:tcW w:type="dxa" w:w="4675"/>
+            <w:shd w:fill="D9D9D9" w:val="clear"/>
+            <w:tcMar>
+              <w:top w:type="dxa" w:w="80"/>
+              <w:left w:type="dxa" w:w="100"/>
+              <w:bottom w:type="dxa" w:w="80"/>
+              <w:right w:type="dxa" w:w="100"/>
+            </w:tcMar>
+            <w:vAlign w:val="center"/>
+          </w:tcPr>
+          <w:p>
+            <w:pPr>
+              <w:jc w:val="center"/>
+            </w:pPr>
+            <w:r>
+              <w:rPr>
+                <w:rFonts w:ascii="Times New Roman" w:cs="Times New Roman" w:eastAsia="Times New Roman" w:hAnsi="Times New Roman"/>
+                <w:b/>
+                <w:bCs/>
+                <w:i w:val="0"/>
+                <w:iCs w:val="false"/>
+                <w:sz w:val="21"/>
+                <w:szCs w:val="20"/>
+              </w:rPr>
+              <w:t>Outcome</w:t>
+            </w:r>
+          </w:p>
+        </w:tc>
+        <w:tc>
+          <w:tcPr>
+            <w:tcW w:type="dxa" w:w="2338"/>
+            <w:shd w:fill="D9D9D9" w:val="clear"/>
+            <w:tcMar>
+              <w:top w:type="dxa" w:w="80"/>
+              <w:left w:type="dxa" w:w="100"/>
+              <w:bottom w:type="dxa" w:w="80"/>
+              <w:right w:type="dxa" w:w="100"/>
+            </w:tcMar>
+            <w:vAlign w:val="center"/>
+          </w:tcPr>
+          <w:p>
+            <w:pPr>
+              <w:jc w:val="center"/>
+            </w:pPr>
+            <w:r>
+              <w:rPr>
+                <w:rFonts w:ascii="Times New Roman" w:cs="Times New Roman" w:eastAsia="Times New Roman" w:hAnsi="Times New Roman"/>
+                <w:b/>
+                <w:bCs/>
+                <w:i w:val="0"/>
+                <w:iCs w:val="false"/>
+                <w:sz w:val="21"/>
+                <w:szCs w:val="20"/>
+              </w:rPr>
+              <w:t>Within-region %</w:t>
+            </w:r>
+          </w:p>
+        </w:tc>
+        <w:tc>
+          <w:tcPr>
+            <w:tcW w:type="dxa" w:w="2338"/>
+            <w:shd w:fill="D9D9D9" w:val="clear"/>
+            <w:tcMar>
+              <w:top w:type="dxa" w:w="80"/>
+              <w:left w:type="dxa" w:w="100"/>
+              <w:bottom w:type="dxa" w:w="80"/>
+              <w:right w:type="dxa" w:w="100"/>
+            </w:tcMar>
+            <w:vAlign w:val="center"/>
+          </w:tcPr>
+          <w:p>
+            <w:pPr>
+              <w:jc w:val="center"/>
+            </w:pPr>
+            <w:r>
+              <w:rPr>
+                <w:rFonts w:ascii="Times New Roman" w:cs="Times New Roman" w:eastAsia="Times New Roman" w:hAnsi="Times New Roman"/>
+                <w:b/>
+                <w:bCs/>
+                <w:i w:val="0"/>
+                <w:iCs w:val="false"/>
+                <w:sz w:val="21"/>
+                <w:szCs w:val="20"/>
+              </w:rPr>
+              <w:t>Between-region %</w:t>
+            </w:r>
+          </w:p>
+        </w:tc>
+      </w:tr>
+      <w:tr>
+        <w:tc>
+          <w:tcPr>
+            <w:tcW w:type="dxa" w:w="4675"/>
+            <w:tcMar>
+              <w:top w:type="dxa" w:w="60"/>
+              <w:left w:type="dxa" w:w="100"/>
+              <w:bottom w:type="dxa" w:w="60"/>
+              <w:right w:type="dxa" w:w="100"/>
+            </w:tcMar>
+            <w:vAlign w:val="center"/>
+          </w:tcPr>
+          <w:p>
+            <w:pPr>
+              <w:jc w:val="left"/>
+            </w:pPr>
+            <w:r>
+              <w:rPr>
+                <w:rFonts w:ascii="Times New Roman" w:cs="Times New Roman" w:eastAsia="Times New Roman" w:hAnsi="Times New Roman"/>
+                <w:b w:val="0"/>
+                <w:bCs w:val="false"/>
+                <w:i w:val="0"/>
+                <w:iCs w:val="false"/>
+                <w:sz w:val="21"/>
+                <w:szCs w:val="20"/>
+              </w:rPr>
+              <w:t>Asthma (primary outcome)</w:t>
+            </w:r>
+          </w:p>
+        </w:tc>
+        <w:tc>
+          <w:tcPr>
+            <w:tcW w:type="dxa" w:w="2338"/>
+            <w:tcMar>
+              <w:top w:type="dxa" w:w="60"/>
+              <w:left w:type="dxa" w:w="100"/>
+              <w:bottom w:type="dxa" w:w="60"/>
+              <w:right w:type="dxa" w:w="100"/>
+            </w:tcMar>
+            <w:vAlign w:val="center"/>
+          </w:tcPr>
+          <w:p>
+            <w:pPr>
+              <w:jc w:val="center"/>
+            </w:pPr>
+            <w:r>
+              <w:rPr>
+                <w:rFonts w:ascii="Times New Roman" w:cs="Times New Roman" w:eastAsia="Times New Roman" w:hAnsi="Times New Roman"/>
+                <w:b w:val="0"/>
+                <w:bCs w:val="false"/>
+                <w:i w:val="0"/>
+                <w:iCs w:val="false"/>
+                <w:sz w:val="21"/>
+                <w:szCs w:val="20"/>
+              </w:rPr>
+              <w:t>1.5%</w:t>
+            </w:r>
+          </w:p>
+        </w:tc>
+        <w:tc>
+          <w:tcPr>
+            <w:tcW w:type="dxa" w:w="2338"/>
+            <w:tcMar>
+              <w:top w:type="dxa" w:w="60"/>
+              <w:left w:type="dxa" w:w="100"/>
+              <w:bottom w:type="dxa" w:w="60"/>
+              <w:right w:type="dxa" w:w="100"/>
+            </w:tcMar>
+            <w:vAlign w:val="center"/>
+          </w:tcPr>
+          <w:p>
+            <w:pPr>
+              <w:jc w:val="center"/>
+            </w:pPr>
+            <w:r>
+              <w:rPr>
+                <w:rFonts w:ascii="Times New Roman" w:cs="Times New Roman" w:eastAsia="Times New Roman" w:hAnsi="Times New Roman"/>
+                <w:b w:val="0"/>
+                <w:bCs w:val="false"/>
+                <w:i w:val="0"/>
+                <w:iCs w:val="false"/>
+                <w:sz w:val="21"/>
+                <w:szCs w:val="20"/>
+              </w:rPr>
+              <w:t>98.5%</w:t>
+            </w:r>
+          </w:p>
+        </w:tc>
+      </w:tr>
+      <w:tr>
+        <w:tc>
+          <w:tcPr>
+            <w:tcW w:type="dxa" w:w="4675"/>
+            <w:tcMar>
+              <w:top w:type="dxa" w:w="60"/>
+              <w:left w:type="dxa" w:w="100"/>
+              <w:bottom w:type="dxa" w:w="60"/>
+              <w:right w:type="dxa" w:w="100"/>
+            </w:tcMar>
+            <w:vAlign w:val="center"/>
+          </w:tcPr>
+          <w:p>
+            <w:pPr>
+              <w:jc w:val="left"/>
+            </w:pPr>
+            <w:r>
+              <w:rPr>
+                <w:rFonts w:ascii="Times New Roman" w:cs="Times New Roman" w:eastAsia="Times New Roman" w:hAnsi="Times New Roman"/>
+                <w:b w:val="0"/>
+                <w:bCs w:val="false"/>
+                <w:i w:val="0"/>
+                <w:iCs w:val="false"/>
+                <w:sz w:val="21"/>
+                <w:szCs w:val="20"/>
+              </w:rPr>
+              <w:t>COPD prevalence</w:t>
+            </w:r>
+          </w:p>
+        </w:tc>
+        <w:tc>
+          <w:tcPr>
+            <w:tcW w:type="dxa" w:w="2338"/>
+            <w:tcMar>
+              <w:top w:type="dxa" w:w="60"/>
+              <w:left w:type="dxa" w:w="100"/>
+              <w:bottom w:type="dxa" w:w="60"/>
+              <w:right w:type="dxa" w:w="100"/>
+            </w:tcMar>
+            <w:vAlign w:val="center"/>
+          </w:tcPr>
+          <w:p>
+            <w:pPr>
+              <w:jc w:val="center"/>
+            </w:pPr>
+            <w:r>
+              <w:rPr>
+                <w:rFonts w:ascii="Times New Roman" w:cs="Times New Roman" w:eastAsia="Times New Roman" w:hAnsi="Times New Roman"/>
+                <w:b w:val="0"/>
+                <w:bCs w:val="false"/>
+                <w:i w:val="0"/>
+                <w:iCs w:val="false"/>
+                <w:sz w:val="21"/>
+                <w:szCs w:val="20"/>
+              </w:rPr>
+              <w:t>2.0%</w:t>
+            </w:r>
+          </w:p>
+        </w:tc>
+        <w:tc>
+          <w:tcPr>
+            <w:tcW w:type="dxa" w:w="2338"/>
+            <w:tcMar>
+              <w:top w:type="dxa" w:w="60"/>
+              <w:left w:type="dxa" w:w="100"/>
+              <w:bottom w:type="dxa" w:w="60"/>
+              <w:right w:type="dxa" w:w="100"/>
+            </w:tcMar>
+            <w:vAlign w:val="center"/>
+          </w:tcPr>
+          <w:p>
+            <w:pPr>
+              <w:jc w:val="center"/>
+            </w:pPr>
+            <w:r>
+              <w:rPr>
+                <w:rFonts w:ascii="Times New Roman" w:cs="Times New Roman" w:eastAsia="Times New Roman" w:hAnsi="Times New Roman"/>
+                <w:b w:val="0"/>
+                <w:bCs w:val="false"/>
+                <w:i w:val="0"/>
+                <w:iCs w:val="false"/>
+                <w:sz w:val="21"/>
+                <w:szCs w:val="20"/>
+              </w:rPr>
+              <w:t>98.0%</w:t>
+            </w:r>
+          </w:p>
+        </w:tc>
+      </w:tr>
+      <w:tr>
+        <w:tc>
+          <w:tcPr>
+            <w:tcW w:type="dxa" w:w="4675"/>
+          </w:tcPr>
+          <w:p>
+            <w:r>
+              <w:rPr>
+                <w:rFonts w:ascii="Times New Roman" w:hAnsi="Times New Roman"/>
+                <w:b w:val="0"/>
+                <w:i w:val="0"/>
+                <w:sz w:val="21"/>
+              </w:rPr>
+              <w:t>Lung cancer incidence</w:t>
+            </w:r>
+          </w:p>
+        </w:tc>
+        <w:tc>
+          <w:tcPr>
+            <w:tcW w:type="dxa" w:w="2338"/>
+          </w:tcPr>
+          <w:p>
+            <w:r>
+              <w:rPr>
+                <w:rFonts w:ascii="Times New Roman" w:hAnsi="Times New Roman"/>
+                <w:b w:val="0"/>
+                <w:i w:val="0"/>
+                <w:sz w:val="21"/>
+              </w:rPr>
+              <w:t>6.5%</w:t>
+            </w:r>
+          </w:p>
+        </w:tc>
+        <w:tc>
+          <w:tcPr>
+            <w:tcW w:type="dxa" w:w="2338"/>
+          </w:tcPr>
+          <w:p>
+            <w:r>
+              <w:rPr>
+                <w:rFonts w:ascii="Times New Roman" w:hAnsi="Times New Roman"/>
+                <w:b w:val="0"/>
+                <w:i w:val="0"/>
+                <w:sz w:val="21"/>
+              </w:rPr>
+              <w:t>93.5%</w:t>
+            </w:r>
+          </w:p>
+        </w:tc>
+      </w:tr>
+      <w:tr>
+        <w:tc>
+          <w:tcPr>
+            <w:tcW w:type="dxa" w:w="4675"/>
+          </w:tcPr>
+          <w:p>
+            <w:r>
+              <w:rPr>
+                <w:rFonts w:ascii="Times New Roman" w:hAnsi="Times New Roman"/>
+                <w:b w:val="0"/>
+                <w:i w:val="0"/>
+                <w:sz w:val="21"/>
+              </w:rPr>
+              <w:t>Low back pain (placebo/negative control)</w:t>
+            </w:r>
+          </w:p>
+        </w:tc>
+        <w:tc>
+          <w:tcPr>
+            <w:tcW w:type="dxa" w:w="2338"/>
+          </w:tcPr>
+          <w:p>
+            <w:r>
+              <w:rPr>
+                <w:rFonts w:ascii="Times New Roman" w:hAnsi="Times New Roman"/>
+                <w:b w:val="0"/>
+                <w:i w:val="0"/>
+                <w:sz w:val="21"/>
+              </w:rPr>
+              <w:t>38.0%</w:t>
+            </w:r>
+          </w:p>
+        </w:tc>
+        <w:tc>
+          <w:tcPr>
+            <w:tcW w:type="dxa" w:w="2338"/>
+          </w:tcPr>
+          <w:p>
+            <w:r>
+              <w:rPr>
+                <w:rFonts w:ascii="Times New Roman" w:hAnsi="Times New Roman"/>
+                <w:b w:val="0"/>
+                <w:i w:val="0"/>
+                <w:sz w:val="21"/>
+              </w:rPr>
+              <w:t>62.0%</w:t>
+            </w:r>
+          </w:p>
+        </w:tc>
+      </w:tr>
+      <w:tr>
+        <w:tc>
+          <w:tcPr>
+            <w:tcW w:type="dxa" w:w="4675"/>
+          </w:tcPr>
+          <w:p>
+            <w:r>
+              <w:rPr>
+                <w:rFonts w:ascii="Times New Roman" w:hAnsi="Times New Roman"/>
+                <w:b w:val="0"/>
+                <w:i w:val="0"/>
+                <w:sz w:val="21"/>
+              </w:rPr>
+              <w:t>Lower respiratory infection incidence</w:t>
+            </w:r>
+          </w:p>
+        </w:tc>
+        <w:tc>
+          <w:tcPr>
+            <w:tcW w:type="dxa" w:w="2338"/>
+          </w:tcPr>
+          <w:p>
+            <w:r>
+              <w:rPr>
+                <w:rFonts w:ascii="Times New Roman" w:hAnsi="Times New Roman"/>
+                <w:b w:val="0"/>
+                <w:i w:val="0"/>
+                <w:sz w:val="21"/>
+              </w:rPr>
+              <w:t>82.8%</w:t>
+            </w:r>
+          </w:p>
+        </w:tc>
+        <w:tc>
+          <w:tcPr>
+            <w:tcW w:type="dxa" w:w="2338"/>
+          </w:tcPr>
+          <w:p>
+            <w:r>
+              <w:rPr>
+                <w:rFonts w:ascii="Times New Roman" w:hAnsi="Times New Roman"/>
+                <w:b w:val="0"/>
+                <w:i w:val="0"/>
+                <w:sz w:val="21"/>
+              </w:rPr>
+              <w:t>17.2%</w:t>
+            </w:r>
+          </w:p>
+        </w:tc>
+      </w:tr>
+      <w:tr>
+        <w:tc>
+          <w:tcPr>
+            <w:tcW w:type="dxa" w:w="4675"/>
+          </w:tcPr>
+          <w:p>
+            <w:r>
+              <w:rPr>
+                <w:rFonts w:ascii="Times New Roman" w:hAnsi="Times New Roman"/>
+                <w:b w:val="0"/>
+                <w:i w:val="0"/>
+                <w:sz w:val="21"/>
+              </w:rPr>
+              <w:t>Respiratory disease mortality</w:t>
+            </w:r>
+          </w:p>
+        </w:tc>
+        <w:tc>
+          <w:tcPr>
+            <w:tcW w:type="dxa" w:w="2338"/>
+          </w:tcPr>
+          <w:p>
+            <w:r>
+              <w:rPr>
+                <w:rFonts w:ascii="Times New Roman" w:hAnsi="Times New Roman"/>
+                <w:b w:val="0"/>
+                <w:i w:val="0"/>
+                <w:sz w:val="21"/>
+              </w:rPr>
+              <w:t>88.6%</w:t>
+            </w:r>
+          </w:p>
+        </w:tc>
+        <w:tc>
+          <w:tcPr>
+            <w:tcW w:type="dxa" w:w="2338"/>
+          </w:tcPr>
+          <w:p>
+            <w:r>
+              <w:rPr>
+                <w:rFonts w:ascii="Times New Roman" w:hAnsi="Times New Roman"/>
+                <w:b w:val="0"/>
+                <w:i w:val="0"/>
+                <w:sz w:val="21"/>
+              </w:rPr>
+              <w:t>11.4%</w:t>
+            </w:r>
+          </w:p>
+        </w:tc>
+      </w:tr>
+    </w:tbl>
     <w:p>
       <w:pPr>
         <w:spacing w:after="120" w:before="220"/>
@@ -3578,7 +4895,7 @@
     </w:p>
     <w:p>
       <w:pPr>
-        <w:spacing w:after="160" w:line="276"/>
+        <w:spacing w:after="160" w:line="360"/>
         <w:jc w:val="both"/>
       </w:pPr>
       <w:r>
@@ -3591,12 +4908,12 @@
           <w:sz w:val="22"/>
           <w:szCs w:val="22"/>
         </w:rPr>
-        <w:t xml:space="preserve">To determine whether the absence of a within-region PM2.5 signal was specific to asthma prevalence or reflected a broader limitation of this panel design, the same two-way fixed-effects specification was applied to four additional respiratory outcomes: lower respiratory infection incidence, COPD prevalence, tracheal/bronchus/lung cancer incidence, and respiratory-disease mortality (Table 4, Figure 6). Of these five outcomes, four — asthma, lower respiratory infections, COPD, and respiratory mortality — showed no statistically significant within-region association with PM2.5 (all p &gt; 0.09). Lung cancer incidence showed a marginally significant result (p = 0.033); however, given that five separate outcomes were tested without correction for multiple comparisons, a single borderline result out of five is consistent with what would be expected by chance alone, and should not be interpreted as evidence of a true effect. Rather than weakening the main result, this consistency across outcomes strengthens it: the absence of a detectable within-region signal is not an artifact of asthma prevalence specifically, but a broader feature of this ecological panel — one likely driven by the same combination of low within-region variance and modeled, smoothed subnational estimates discussed above. Future work using outcome variables with genuinely high-frequency variation (e.g., facility-level emergency admissions) would be better positioned to test whether a real effect exists beneath this noise floor.</w:t>
-      </w:r>
-    </w:p>
-    <w:p>
-      <w:pPr>
-        <w:spacing w:after="240" w:line="276"/>
+        <w:t>To determine whether the absent within-region PM2.5 signal was specific to asthma or reflected a broader panel limitation, the same two-way fixed-effects specification was applied to four additional outcomes: lower respiratory infection incidence, COPD prevalence, lung cancer incidence, and respiratory-disease mortality (Table 6, Figure 6). These five outcomes are treated as a post hoc exploratory family, with Table 6 reporting each raw p-value alongside a Holm-Bonferroni correction (Holm, 1979) applied across all 5 tests. Three of five — LRI, COPD, and respiratory disease mortality — showed no significant within-region association (all p &gt; 0.09). Lung cancer’s marginally significant raw result (p = 0.033) does not survive correction (adjusted p = 0.133), while asthma remains significant (adjusted p = 0.012) because its raw p-value was an order of magnitude smaller than the others — formalizing, rather than changing, this manuscript’s existing chance-consistent reading of the lung cancer result. Rather than weakening the main finding, this consistency strengthens it: the absent within-region signal is a broader feature of this ecological panel, not an artifact specific to asthma — likely driven by the same combination of low within-region variance and smoothed subnational estimates discussed above. Future work using genuinely high-frequency outcome variables (e.g., facility-level emergency admissions) would be better positioned to test for a real effect beneath this noise floor.</w:t>
+      </w:r>
+    </w:p>
+    <w:p>
+      <w:pPr>
+        <w:spacing w:after="240" w:line="360"/>
         <w:jc w:val="both"/>
       </w:pPr>
       <w:r>
@@ -3609,7 +4926,7 @@
           <w:sz w:val="20"/>
           <w:szCs w:val="20"/>
         </w:rPr>
-        <w:t xml:space="preserve">Table 4. </w:t>
+        <w:t>Table 6. Two-way fixed-effects panel regression results across five respiratory-related outcomes. All models include 17 region and 10 year fixed effects; standard errors clustered by region. Philippines, 2013–2022, n = 170 region-years each. These five outcomes are treated as a post hoc exploratory family (not part of the pre-specified primary specification); the rightmost column reports p-values after a Holm-Bonferroni correction (Holm, 1979) applied across the 5 tests. * = still significant (adjusted p &lt; 0.05).</w:t>
       </w:r>
       <w:r>
         <w:rPr>
@@ -3621,7 +4938,6 @@
           <w:sz w:val="20"/>
           <w:szCs w:val="20"/>
         </w:rPr>
-        <w:t xml:space="preserve">Two-way fixed-effects panel regression results across five respiratory-related outcomes. All models include 17 region and 10 year fixed effects; standard errors clustered by region. Philippines, 2013–2022, n = 170 region-years each. No correction for multiple comparisons was applied.</w:t>
       </w:r>
     </w:p>
     <w:tbl>
@@ -3643,6 +4959,7 @@
         <w:gridCol w:w="1300"/>
         <w:gridCol w:w="1300"/>
         <w:gridCol w:w="1000"/>
+        <w:gridCol w:w="1102"/>
       </w:tblGrid>
       <w:tr>
         <w:trPr>
@@ -3828,6 +5145,26 @@
             </w:r>
           </w:p>
         </w:tc>
+        <w:tc>
+          <w:tcPr>
+            <w:tcW w:type="dxa" w:w="1102"/>
+          </w:tcPr>
+          <w:p>
+            <w:pPr>
+              <w:jc w:val="center"/>
+            </w:pPr>
+            <w:r/>
+            <w:r>
+              <w:rPr>
+                <w:rFonts w:ascii="Times New Roman" w:hAnsi="Times New Roman"/>
+                <w:b/>
+                <w:i w:val="0"/>
+                <w:sz w:val="20"/>
+              </w:rPr>
+              <w:t>Holm-adj. p</w:t>
+            </w:r>
+          </w:p>
+        </w:tc>
       </w:tr>
       <w:tr>
         <w:tc>
@@ -4004,6 +5341,26 @@
             </w:r>
           </w:p>
         </w:tc>
+        <w:tc>
+          <w:tcPr>
+            <w:tcW w:type="dxa" w:w="1102"/>
+          </w:tcPr>
+          <w:p>
+            <w:pPr>
+              <w:jc w:val="center"/>
+            </w:pPr>
+            <w:r/>
+            <w:r>
+              <w:rPr>
+                <w:rFonts w:ascii="Times New Roman" w:hAnsi="Times New Roman"/>
+                <w:b w:val="0"/>
+                <w:i w:val="0"/>
+                <w:sz w:val="20"/>
+              </w:rPr>
+              <w:t>0.0120*</w:t>
+            </w:r>
+          </w:p>
+        </w:tc>
       </w:tr>
       <w:tr>
         <w:tc>
@@ -4180,6 +5537,26 @@
             </w:r>
           </w:p>
         </w:tc>
+        <w:tc>
+          <w:tcPr>
+            <w:tcW w:type="dxa" w:w="1102"/>
+          </w:tcPr>
+          <w:p>
+            <w:pPr>
+              <w:jc w:val="center"/>
+            </w:pPr>
+            <w:r/>
+            <w:r>
+              <w:rPr>
+                <w:rFonts w:ascii="Times New Roman" w:hAnsi="Times New Roman"/>
+                <w:b w:val="0"/>
+                <w:i w:val="0"/>
+                <w:sz w:val="20"/>
+              </w:rPr>
+              <w:t>0.1332</w:t>
+            </w:r>
+          </w:p>
+        </w:tc>
       </w:tr>
       <w:tr>
         <w:tc>
@@ -4356,6 +5733,26 @@
             </w:r>
           </w:p>
         </w:tc>
+        <w:tc>
+          <w:tcPr>
+            <w:tcW w:type="dxa" w:w="1102"/>
+          </w:tcPr>
+          <w:p>
+            <w:pPr>
+              <w:jc w:val="center"/>
+            </w:pPr>
+            <w:r/>
+            <w:r>
+              <w:rPr>
+                <w:rFonts w:ascii="Times New Roman" w:hAnsi="Times New Roman"/>
+                <w:b w:val="0"/>
+                <w:i w:val="0"/>
+                <w:sz w:val="20"/>
+              </w:rPr>
+              <w:t>0.2775</w:t>
+            </w:r>
+          </w:p>
+        </w:tc>
       </w:tr>
       <w:tr>
         <w:tc>
@@ -4532,6 +5929,26 @@
             </w:r>
           </w:p>
         </w:tc>
+        <w:tc>
+          <w:tcPr>
+            <w:tcW w:type="dxa" w:w="1102"/>
+          </w:tcPr>
+          <w:p>
+            <w:pPr>
+              <w:jc w:val="center"/>
+            </w:pPr>
+            <w:r/>
+            <w:r>
+              <w:rPr>
+                <w:rFonts w:ascii="Times New Roman" w:hAnsi="Times New Roman"/>
+                <w:b w:val="0"/>
+                <w:i w:val="0"/>
+                <w:sz w:val="20"/>
+              </w:rPr>
+              <w:t>0.2775</w:t>
+            </w:r>
+          </w:p>
+        </w:tc>
       </w:tr>
       <w:tr>
         <w:tc>
@@ -4705,6 +6122,26 @@
                 <w:szCs w:val="20"/>
               </w:rPr>
               <w:t xml:space="preserve">170</w:t>
+            </w:r>
+          </w:p>
+        </w:tc>
+        <w:tc>
+          <w:tcPr>
+            <w:tcW w:type="dxa" w:w="1102"/>
+          </w:tcPr>
+          <w:p>
+            <w:pPr>
+              <w:jc w:val="center"/>
+            </w:pPr>
+            <w:r/>
+            <w:r>
+              <w:rPr>
+                <w:rFonts w:ascii="Times New Roman" w:hAnsi="Times New Roman"/>
+                <w:b w:val="0"/>
+                <w:i w:val="0"/>
+                <w:sz w:val="20"/>
+              </w:rPr>
+              <w:t>0.2775</w:t>
             </w:r>
           </w:p>
         </w:tc>
@@ -4758,7 +6195,7 @@
     </w:p>
     <w:p>
       <w:pPr>
-        <w:spacing w:after="240" w:line="276"/>
+        <w:spacing w:after="240" w:line="360"/>
         <w:jc w:val="both"/>
       </w:pPr>
       <w:r>
@@ -4771,7 +6208,7 @@
           <w:sz w:val="20"/>
           <w:szCs w:val="20"/>
         </w:rPr>
-        <w:t xml:space="preserve">Figure 6. </w:t>
+        <w:t>Figure 6. Forest plot of two-way fixed-effects β coefficients (PM2.5 predicting each outcome, region and year effects) across five respiratory-related outcomes, Philippines, 2013–2022. Points show the fixed-effects β for each outcome; horizontal bars represent 95% confidence intervals clustered by region. The dashed vertical line marks β = 0. Asterisks in this figure denote uncorrected p &lt; 0.05; see Table 6 for the same five p-values after a Holm-Bonferroni correction across this exploratory family.</w:t>
       </w:r>
       <w:r>
         <w:rPr>
@@ -4783,14 +6220,12 @@
           <w:sz w:val="20"/>
           <w:szCs w:val="20"/>
         </w:rPr>
-        <w:t xml:space="preserve">Forest plot of two-way fixed-effects β coefficients (PM2.5 predicting each outcome, region and year effects) across five respiratory-related outcomes, Philippines, 2013–2022. Points show the fixed-effects β for each outcome; horizontal bars represent 95% confidence intervals clustered by region. The dashed vertical line marks β = 0. No correction for multiple comparisons was applied across the 5 tests; asterisks denote uncorrected p &lt; 0.05.</w:t>
       </w:r>
       <w:commentRangeEnd w:id="1"/>
       <w:r>
         <w:rPr>
           <w:rStyle w:val="CommentReference"/>
         </w:rPr>
-        <w:commentReference w:id="1"/>
       </w:r>
     </w:p>
     <w:p>
@@ -4819,7 +6254,66 @@
           <w:i w:val="0"/>
           <w:sz w:val="22"/>
         </w:rPr>
-        <w:t>Across all robustness checks conducted for the primary coefficient — clustered standard errors, label- and block-permutation tests, a wild cluster bootstrap, a leave-one-region-out jackknife, and exclusion of the COVID-19 pandemic years — the two-way fixed-effects estimate was directionally consistent (always negative) and statistically significant in every check except one (excluding 2020–2021, where it narrowly missed conventional significance at p = 0.088). The estimate was measurably, though not fully, sensitive to two specific features of the data: the National Capital Region and the two pandemic years. Alternative exposure-timing specifications (1/2/3-year lags, 3-year rolling mean) did not overturn the negative sign at any lag, and a cumulative 3-year exposure measure produced the strongest result of any specification tested. A Hausman-style comparison against random effects could not be formally tested due to a known finite-sample degeneracy, but the substantial divergence between the fixed- and random-effects point estimates is itself informal evidence for the region-level confounding this manuscript’s central argument describes. Moran’s I found no evidence of residual spatial autocorrelation, supporting the region-clustered standard errors used throughout. A placebo/negative-control test using an outcome with no plausible PM2.5 pathway (low back pain prevalence) found no significant association (p = 0.664), supporting the primary null as a genuine finding rather than an artifact of the GBD estimation pipeline. Taken together, these checks support treating the primary null/negative finding as a genuine feature of this dataset rather than an artifact of any single modeling choice, while also making explicit exactly where that finding is least secure (NCR, the pandemic years, and the overall statistical power of the design, quantified above as an MDE of ≈ 2.33).</w:t>
+        <w:t>Figure 11 summarizes this stress test as a specification curve: the primary coefficient re-estimated across 25 reasonable analytic choices — exposure timing (same-year, lagged, cumulative), sample (full panel, COVID-excluded, each of 17 single-region exclusions), trend flexibility, and covariate adjustment. Every specification remained negative; 22 of 25 were significant at conventional thresholds. The three non-significant points were the COVID-excluded sample (p = 0.088) and the 2- and 3-year lag specifications (p = 0.054 and p = 0.151); all 17 leave-one-region-out refits remained significant (Table 4). The region-specific-trends specification produced both the smallest-magnitude and least-significant point in the curve (β = −0.937, p = 0.038, a 63% reduction from the primary estimate) — the single check that most changes how confidently this result should be read, and it is treated here as genuine evidence of fragility rather than explained away. The Hausman comparison and Moran’s I (Table 4) address the standard error’s reliability rather than the point estimate; the placebo outcome (low back pain, p = 0.664) argues against the null reflecting a GBD-pipeline artifact. Together, these checks support the primary finding as directionally stable but only narrowly robust.</w:t>
+      </w:r>
+    </w:p>
+    <w:p>
+      <w:pPr>
+        <w:jc w:val="center"/>
+      </w:pPr>
+      <w:r>
+        <w:drawing>
+          <wp:inline xmlns:a="http://schemas.openxmlformats.org/drawingml/2006/main" xmlns:pic="http://schemas.openxmlformats.org/drawingml/2006/picture">
+            <wp:extent cx="3749039" cy="2658409"/>
+            <wp:docPr id="7" name="Picture 7"/>
+            <wp:cNvGraphicFramePr>
+              <a:graphicFrameLocks noChangeAspect="1"/>
+            </wp:cNvGraphicFramePr>
+            <a:graphic>
+              <a:graphicData uri="http://schemas.openxmlformats.org/drawingml/2006/picture">
+                <pic:pic>
+                  <pic:nvPicPr>
+                    <pic:cNvPr id="0" name="specification_curve.png"/>
+                    <pic:cNvPicPr/>
+                  </pic:nvPicPr>
+                  <pic:blipFill>
+                    <a:blip r:embed="rId20"/>
+                    <a:stretch>
+                      <a:fillRect/>
+                    </a:stretch>
+                  </pic:blipFill>
+                  <pic:spPr>
+                    <a:xfrm>
+                      <a:off x="0" y="0"/>
+                      <a:ext cx="3749039" cy="2658409"/>
+                    </a:xfrm>
+                    <a:prstGeom prst="rect"/>
+                  </pic:spPr>
+                </pic:pic>
+              </a:graphicData>
+            </a:graphic>
+          </wp:inline>
+        </w:drawing>
+      </w:r>
+    </w:p>
+    <w:p>
+      <w:r>
+        <w:rPr>
+          <w:rFonts w:ascii="Times New Roman" w:hAnsi="Times New Roman"/>
+          <w:b/>
+          <w:i/>
+          <w:sz w:val="19"/>
+        </w:rPr>
+        <w:t xml:space="preserve">Figure 11. </w:t>
+      </w:r>
+      <w:r>
+        <w:rPr>
+          <w:rFonts w:ascii="Times New Roman" w:hAnsi="Times New Roman"/>
+          <w:b w:val="0"/>
+          <w:i/>
+          <w:sz w:val="19"/>
+        </w:rPr>
+        <w:t>Specification curve for the two-way fixed-effects β across 25 specifications — exposure timing, sample composition (incl. leave-one-region-out), trend flexibility, and covariate adjustment (Simonsohn, Simmons &amp; Nelson, 2020). Points colored by significance (p &lt; 0.05); bars are 95% CIs (clustered SE). Lower panel indicates which analytic choice each point reflects. All points are drawn from this manuscript’s own already-reported robustness-check results (Tables 3, 4, 6); no new regressions were estimated for this figure.</w:t>
       </w:r>
     </w:p>
     <w:p>
@@ -4841,7 +6335,7 @@
     </w:p>
     <w:p>
       <w:pPr>
-        <w:spacing w:after="160" w:line="276"/>
+        <w:spacing w:after="160" w:line="360"/>
         <w:jc w:val="both"/>
       </w:pPr>
       <w:r>
@@ -4859,7 +6353,7 @@
     </w:p>
     <w:p>
       <w:pPr>
-        <w:spacing w:after="160" w:line="276"/>
+        <w:spacing w:after="160" w:line="360"/>
         <w:jc w:val="both"/>
       </w:pPr>
       <w:r>
@@ -4872,7 +6366,7 @@
           <w:sz w:val="22"/>
           <w:szCs w:val="22"/>
         </w:rPr>
-        <w:t xml:space="preserve">Davao City’s regional-average PM2.5 relative to WHO’s Interim Target-3, and how the satellite-derived estimates used here compare against real ground-station monitoring from the Environmental Management Bureau Region XI, is examined directly — including where the two sources disagree and why — in the Davao City Case Study subsection immediately below, rather than summarized as a single claim here.</w:t>
+        <w:t>The Davao City Case Study below examines this in detail, including a ground-station validation of the satellite exposure measure and a broader satellite product-version-drift finding relevant beyond this study.</w:t>
       </w:r>
     </w:p>
     <w:p>
@@ -4902,7 +6396,7 @@
     </w:p>
     <w:p>
       <w:pPr>
-        <w:spacing w:after="160" w:line="276"/>
+        <w:spacing w:after="160" w:line="360"/>
         <w:jc w:val="both"/>
       </w:pPr>
       <w:r>
@@ -4915,7 +6409,7 @@
           <w:sz w:val="22"/>
           <w:szCs w:val="22"/>
         </w:rPr>
-        <w:t xml:space="preserve">The main analysis in this study relies on satellite-derived PM2.5 estimates (ACAG V6.GL.02.04) rather than ground-based monitoring, because ground monitoring in the Philippines is too sparse and inconsistent to support a 17-region, 10-year panel. Davao City — one of the few Philippine cities with a multi-year network of government air quality monitors — offers a chance to check that choice directly: how well does satellite-derived PM2.5 agree with real, ground-measured PM2.5 at the city level? This section reports that comparison as a standalone validation layer. It does not feed into, or change, the main regional panel results.</w:t>
+        <w:t>The main analysis relies on satellite-derived PM2.5 estimates (ACAG V6.GL.02.04) rather than ground-based monitoring, because ground monitoring in the Philippines is too sparse and inconsistent to support a 17-region, 10-year panel. Davao City — one of the few Philippine cities with a multi-year network of government air quality monitors — offers a chance to check that choice directly: how well does satellite-derived PM2.5 agree with real, ground-measured PM2.5 at the city level? This section reports that comparison and a related methodological finding about satellite product-version drift (below), relevant beyond this study; neither result feeds into or changes the main regional panel results.</w:t>
       </w:r>
     </w:p>
     <w:p>
@@ -4937,7 +6431,7 @@
     </w:p>
     <w:p>
       <w:pPr>
-        <w:spacing w:after="160" w:line="276"/>
+        <w:spacing w:after="160" w:line="360"/>
         <w:jc w:val="both"/>
       </w:pPr>
       <w:r>
@@ -4955,7 +6449,7 @@
     </w:p>
     <w:p>
       <w:pPr>
-        <w:spacing w:after="160" w:line="276"/>
+        <w:spacing w:after="160" w:line="360"/>
         <w:jc w:val="both"/>
       </w:pPr>
       <w:r>
@@ -4977,7 +6471,7 @@
           <w:ilvl w:val="0"/>
           <w:numId w:val="1"/>
         </w:numPr>
-        <w:spacing w:after="120" w:line="276"/>
+        <w:spacing w:after="120" w:line="360"/>
         <w:jc w:val="both"/>
       </w:pPr>
       <w:r>
@@ -4990,7 +6484,7 @@
           <w:sz w:val="22"/>
           <w:szCs w:val="22"/>
         </w:rPr>
-        <w:t xml:space="preserve">Station 07/17 continuity. EMB relocated this station (from a J.P. Laurel Avenue site to Marfori Heights) around 2023 and its own reports are internally inconsistent about when the change took effect. A single continuous “Station 07/17” series was retained using the 2021–2022 values both reports agree on, but the series may represent two distinct physical locations rather than one continuously monitored site.</w:t>
+        <w:t>Station 07/17 continuity and 2020 data capture. EMB relocated Station 07/17 (J.P. Laurel Avenue to Marfori Heights) around 2023, with reports disagreeing on the exact date — the retained series uses only the 2021–2022 values both reports agree on, but may span two physical locations. Separately, EMB’s 2022 report notes Stations 15 and 16 fell below the required 75% annual data-capture rate in 2020; the reported values (26.42, 24.48 µg/m³ PM10) are the only figures available and should be treated as less reliable than other years.</w:t>
       </w:r>
     </w:p>
     <w:p>
@@ -4999,7 +6493,7 @@
           <w:ilvl w:val="0"/>
           <w:numId w:val="1"/>
         </w:numPr>
-        <w:spacing w:after="120" w:line="276"/>
+        <w:spacing w:after="120" w:line="360"/>
         <w:jc w:val="both"/>
       </w:pPr>
       <w:r>
@@ -5012,16 +6506,12 @@
           <w:sz w:val="22"/>
           <w:szCs w:val="22"/>
         </w:rPr>
-        <w:t xml:space="preserve">2020 data-capture flag. EMB’s own 2022 report notes that Stations 15 and 16 fell below the required 75% annual data-capture rate in 2020. The reported values (26.42 and 24.48 µg/m³ PM10) are included as the only figures available, but should be treated as less reliable than other years.</w:t>
-      </w:r>
-    </w:p>
-    <w:p>
-      <w:pPr>
-        <w:numPr>
-          <w:ilvl w:val="0"/>
-          <w:numId w:val="1"/>
-        </w:numPr>
-        <w:spacing w:after="120" w:line="276"/>
+        <w:t>2024 reporting quirks. 2024 values are rounded whole numbers from a three-year summary table in the 2025 RSOBER, unlike the decimal-precision figures reported for 2020–2023; the same report also notes that May 2024 manual-station PM10 readings involved EMB-approved data substitution to meet minimum coverage requirements, which does not change the reported annual mean but is disclosed for provenance.</w:t>
+      </w:r>
+    </w:p>
+    <w:p>
+      <w:pPr>
+        <w:spacing w:after="160" w:line="360"/>
         <w:jc w:val="both"/>
       </w:pPr>
       <w:r>
@@ -5034,18 +6524,16 @@
           <w:sz w:val="22"/>
           <w:szCs w:val="22"/>
         </w:rPr>
-        <w:t xml:space="preserve">2024 precision. 2024 values are available only as rounded whole numbers from a three-year summary table in the 2025 RSOBER, unlike the decimal-precision figures reported for 2020–2023 in the earlier two reports.</w:t>
-      </w:r>
-    </w:p>
-    <w:p>
-      <w:pPr>
-        <w:numPr>
-          <w:ilvl w:val="0"/>
-          <w:numId w:val="1"/>
-        </w:numPr>
-        <w:spacing w:after="120" w:line="276"/>
-        <w:jc w:val="both"/>
-      </w:pPr>
+        <w:t xml:space="preserve">Satellite data. Annual PM2.5 (µg/m³) for 2020–2024 was extracted from ACAG’s V6GL03 CNN-based global PM2.5 product</w:t>
+      </w:r>
+      <w:r>
+        <w:rPr>
+          <w:rFonts w:ascii="Times New Roman" w:cs="Times New Roman" w:eastAsia="Times New Roman" w:hAnsi="Times New Roman"/>
+          <w:sz w:val="22"/>
+          <w:szCs w:val="22"/>
+        </w:rPr>
+        <w:footnoteReference w:id="1"/>
+      </w:r>
       <w:r>
         <w:rPr>
           <w:rFonts w:ascii="Times New Roman" w:cs="Times New Roman" w:eastAsia="Times New Roman" w:hAnsi="Times New Roman"/>
@@ -5056,63 +6544,7 @@
           <w:sz w:val="22"/>
           <w:szCs w:val="22"/>
         </w:rPr>
-        <w:t xml:space="preserve">2024 data substitution. The 2025 RSOBER notes that May 2024 manual-station PM10 readings involved EMB-approved data substitution to meet minimum coverage requirements. This does not change the reported annual mean but is disclosed here for provenance.</w:t>
-      </w:r>
-    </w:p>
-    <w:p>
-      <w:pPr>
-        <w:spacing w:after="160" w:line="276"/>
-        <w:jc w:val="both"/>
-      </w:pPr>
-      <w:r>
-        <w:rPr>
-          <w:rFonts w:ascii="Times New Roman" w:cs="Times New Roman" w:eastAsia="Times New Roman" w:hAnsi="Times New Roman"/>
-          <w:b w:val="false"/>
-          <w:bCs w:val="false"/>
-          <w:i w:val="false"/>
-          <w:iCs w:val="false"/>
-          <w:sz w:val="22"/>
-          <w:szCs w:val="22"/>
-        </w:rPr>
-        <w:t xml:space="preserve">Satellite data. Annual PM2.5 (µg/m³) for 2020–2024 was extracted from ACAG’s V6GL03 CNN-based global PM2.5 product</w:t>
-      </w:r>
-      <w:r>
-        <w:rPr>
-          <w:rFonts w:ascii="Times New Roman" w:cs="Times New Roman" w:eastAsia="Times New Roman" w:hAnsi="Times New Roman"/>
-          <w:sz w:val="22"/>
-          <w:szCs w:val="22"/>
-        </w:rPr>
-        <w:footnoteReference w:id="1"/>
-      </w:r>
-      <w:r>
-        <w:rPr>
-          <w:rFonts w:ascii="Times New Roman" w:cs="Times New Roman" w:eastAsia="Times New Roman" w:hAnsi="Times New Roman"/>
-          <w:b w:val="false"/>
-          <w:bCs w:val="false"/>
-          <w:i w:val="false"/>
-          <w:iCs w:val="false"/>
-          <w:sz w:val="22"/>
-          <w:szCs w:val="22"/>
-        </w:rPr>
         <w:t xml:space="preserve"> (0.1° resolution), clipped to the Davao City boundary (GADM Philippines, level 2 administrative boundaries). Nineteen 0.1° grid cells fall within the city boundary, consistent with Davao City’s land area of approximately 2,440 km².</w:t>
-      </w:r>
-    </w:p>
-    <w:p>
-      <w:pPr>
-        <w:spacing w:after="160" w:line="276"/>
-        <w:jc w:val="both"/>
-      </w:pPr>
-      <w:r>
-        <w:rPr>
-          <w:rFonts w:ascii="Times New Roman" w:cs="Times New Roman" w:eastAsia="Times New Roman" w:hAnsi="Times New Roman"/>
-          <w:b w:val="false"/>
-          <w:bCs w:val="false"/>
-          <w:i w:val="false"/>
-          <w:iCs w:val="false"/>
-          <w:sz w:val="22"/>
-          <w:szCs w:val="22"/>
-        </w:rPr>
-        <w:t xml:space="preserve">Version sensitivity check. Because the main regional panel uses an earlier ACAG release (V6GL02.04) while the Davao satellite comparison used the current release (V6GL03), the same Davao City clip was re-run on the three overlapping years (2020–2022) using the older V6GL02.04 files, to test whether any satellite-ground discrepancy reflected atmospheric reality or a product-version artifact.</w:t>
       </w:r>
     </w:p>
     <w:p>
@@ -5134,7 +6566,7 @@
     </w:p>
     <w:p>
       <w:pPr>
-        <w:spacing w:after="240" w:line="276"/>
+        <w:spacing w:after="240" w:line="360"/>
         <w:jc w:val="both"/>
       </w:pPr>
       <w:r>
@@ -5147,7 +6579,7 @@
           <w:sz w:val="20"/>
           <w:szCs w:val="20"/>
         </w:rPr>
-        <w:t xml:space="preserve">Table 5. </w:t>
+        <w:t xml:space="preserve">Table 7. </w:t>
       </w:r>
       <w:r>
         <w:rPr>
@@ -5898,7 +7330,7 @@
     </w:tbl>
     <w:p>
       <w:pPr>
-        <w:spacing w:after="160" w:line="276"/>
+        <w:spacing w:after="160" w:line="360"/>
         <w:jc w:val="both"/>
       </w:pPr>
       <w:r>
@@ -5916,7 +7348,7 @@
     </w:p>
     <w:p>
       <w:pPr>
-        <w:spacing w:after="160" w:line="276"/>
+        <w:spacing w:after="160" w:line="360"/>
         <w:jc w:val="both"/>
       </w:pPr>
       <w:r>
@@ -5934,7 +7366,36 @@
     </w:p>
     <w:p>
       <w:pPr>
-        <w:spacing w:after="240" w:line="276"/>
+        <w:spacing w:before="220" w:after="120"/>
+      </w:pPr>
+      <w:r>
+        <w:rPr>
+          <w:rFonts w:ascii="Times New Roman" w:hAnsi="Times New Roman"/>
+          <w:b/>
+          <w:i w:val="0"/>
+          <w:sz w:val="22"/>
+        </w:rPr>
+        <w:t>Satellite Product-Version Drift: A Caution Beyond This Study</w:t>
+      </w:r>
+    </w:p>
+    <w:p>
+      <w:pPr>
+        <w:spacing w:after="160"/>
+        <w:jc w:val="both"/>
+      </w:pPr>
+      <w:r>
+        <w:rPr>
+          <w:rFonts w:ascii="Times New Roman" w:hAnsi="Times New Roman"/>
+          <w:b w:val="0"/>
+          <w:i w:val="0"/>
+          <w:sz w:val="22"/>
+        </w:rPr>
+        <w:t>Because the main regional panel uses an earlier ACAG release (V6.GL.02.04) while the Davao comparison above used the current release (V6GL03), the same Davao City clip was re-run on the three overlapping years (2020–2022) using the older V6.GL.02.04 files, to test whether the satellite-ground gap reflected atmospheric reality or a product-version artifact (Table 8).</w:t>
+      </w:r>
+    </w:p>
+    <w:p>
+      <w:pPr>
+        <w:spacing w:after="240" w:line="360"/>
         <w:jc w:val="both"/>
       </w:pPr>
       <w:r>
@@ -5947,7 +7408,7 @@
           <w:sz w:val="20"/>
           <w:szCs w:val="20"/>
         </w:rPr>
-        <w:t xml:space="preserve">Table 6. </w:t>
+        <w:t xml:space="preserve">Table 8. </w:t>
       </w:r>
       <w:r>
         <w:rPr>
@@ -6816,7 +8277,7 @@
     </w:tbl>
     <w:p>
       <w:pPr>
-        <w:spacing w:after="160" w:line="276"/>
+        <w:spacing w:after="160" w:line="360"/>
         <w:jc w:val="both"/>
       </w:pPr>
       <w:r>
@@ -6829,7 +8290,22 @@
           <w:sz w:val="22"/>
           <w:szCs w:val="22"/>
         </w:rPr>
-        <w:t xml:space="preserve">The older ACAG release tracked the ground stations substantially more closely (mean absolute error 1.48 µg/m³) than the current release (mean absolute error 3.65 µg/m³) over the same three years, same city boundary, and same grid cells. The current release was, on average, 2.87 µg/m³ higher than the older release for identical location-years. This indicates that most — though not necessarily all — of the apparent satellite-ground gap in the 2020–2024 comparison reflects a systematic shift introduced by the ACAG algorithm/version update, rather than a true change in atmospheric PM2.5 that ground stations failed to capture. With only three overlapping years, this finding should be read as evidence of a real and non-trivial version effect, not as a precise estimate of its size.</w:t>
+        <w:t xml:space="preserve">The older ACAG release tracked the ground stations substantially more closely (mean absolute error 1.48 µg/m³) than the current release (mean absolute error 3.65 µg/m³) over the same three years, same city boundary, and same grid cells. The current release was, on average, 2.87 µg/m³ higher than the older release for identical location-years. This indicates that most — though not necessarily all — of the apparent satellite-ground gap reflects a systematic shift introduced by the ACAG algorithm/version update, rather than a true change in atmospheric PM2.5 that ground stations failed to capture. With only three overlapping years, this should be read as evidence of a real, non-trivial version effect, not a precise estimate of its size.</w:t>
+      </w:r>
+    </w:p>
+    <w:p>
+      <w:pPr>
+        <w:spacing w:after="160"/>
+        <w:jc w:val="both"/>
+      </w:pPr>
+      <w:r>
+        <w:rPr>
+          <w:rFonts w:ascii="Times New Roman" w:hAnsi="Times New Roman"/>
+          <w:b w:val="0"/>
+          <w:i w:val="0"/>
+          <w:sz w:val="22"/>
+        </w:rPr>
+        <w:t>This is not a Davao-specific or single-paper concern. Any ecological PM2.5 study that mixes satellite product releases across time — or upgrades mid-study to a newer release, as most groups extending a panel forward eventually will — risks introducing a spurious trend, or masking a real one, purely from a change in the retrieval algorithm rather than atmospheric PM2.5 itself. Researchers using ACAG or comparable modeled satellite PM2.5 products for multi-year subnational panels should run a within-location, cross-version check like this one before treating a multi-year series as internally consistent, particularly around known release-transition years. The main 17-region panel here avoids this risk because it uses a single ACAG release (V6.GL.02.04) consistently across all regions and years; this check is reported as a secondary methodological contribution, not merely a footnote to the Davao comparison above.</w:t>
       </w:r>
     </w:p>
     <w:p>
@@ -6851,7 +8327,7 @@
     </w:p>
     <w:p>
       <w:pPr>
-        <w:spacing w:after="160" w:line="276"/>
+        <w:spacing w:after="160" w:line="360"/>
         <w:jc w:val="both"/>
       </w:pPr>
       <w:r>
@@ -6864,12 +8340,33 @@
           <w:sz w:val="22"/>
           <w:szCs w:val="22"/>
         </w:rPr>
-        <w:t xml:space="preserve">This validation exercise supports two conclusions relevant to the main study. First, satellite-derived PM2.5 products are not immune to systematic drift between algorithm versions, and comparisons across product releases — even for the same underlying atmosphere — should not be treated as directly comparable without checking for this. Second, the main 17-region panel uses a single ACAG release (V6GL02.04) consistently across all years and regions, so this version-sensitivity issue does not affect its internal validity. It matters only for future work that mixes ACAG releases across time or extends the panel using newer satellite products.</w:t>
-      </w:r>
-    </w:p>
-    <w:p>
-      <w:pPr>
-        <w:spacing w:after="160" w:line="276"/>
+        <w:t>Together with the version check above, this validation exercise supports one further conclusion: because the main 17-region panel uses a single ACAG release (V6.GL.02.04) consistently across all years and regions, the version-sensitivity issue documented above does not affect its internal validity, mattering chiefly for future work that mixes ACAG releases across time. The gap that persists even after accounting for the version effect (most visibly in 2020–2021) likely reflects some combination of spatial-averaging differences between a 0.1° satellite pixel and point-source ground monitors, the ground stations’ documented 2020 data-capture shortfall, and genuine limits on satellite retrieval accuracy over a coastal, cloud-prone tropical city; this study cannot distinguish between them, and each would also apply, to some degree, to the satellite-derived PM2.5 used throughout the main regional panel.</w:t>
+      </w:r>
+    </w:p>
+    <w:p>
+      <w:pPr>
+        <w:spacing w:after="120" w:before="160"/>
+      </w:pPr>
+      <w:r>
+        <w:rPr>
+          <w:rFonts w:ascii="Times New Roman" w:cs="Times New Roman" w:eastAsia="Times New Roman" w:hAnsi="Times New Roman"/>
+          <w:b/>
+          <w:bCs/>
+          <w:i w:val="false"/>
+          <w:iCs w:val="false"/>
+          <w:sz w:val="22"/>
+          <w:szCs w:val="22"/>
+        </w:rPr>
+        <w:t xml:space="preserve">Limitations Specific to This Validation Layer</w:t>
+      </w:r>
+    </w:p>
+    <w:p>
+      <w:pPr>
+        <w:numPr>
+          <w:ilvl w:val="0"/>
+          <w:numId w:val="1"/>
+        </w:numPr>
+        <w:spacing w:after="120" w:line="360"/>
         <w:jc w:val="both"/>
       </w:pPr>
       <w:r>
@@ -6882,12 +8379,12 @@
           <w:sz w:val="22"/>
           <w:szCs w:val="22"/>
         </w:rPr>
-        <w:t xml:space="preserve">The residual gap that persists even after accounting for the version effect (most visibly in 2020–2021) is consistent with several possible explanations that this study cannot distinguish between: genuine spatial averaging differences between a 0.1° satellite pixel and point-source ground monitors, the ground stations’ own documented data-capture shortfall in 2020, or true limitations in satellite retrieval accuracy over a coastal, cloud-prone tropical city. Any of these would also apply, to some degree, to the satellite-derived PM2.5 used throughout the main regional panel, and is noted as a limitation of that analysis as well.</w:t>
-      </w:r>
-    </w:p>
-    <w:p>
-      <w:pPr>
-        <w:spacing w:after="120" w:before="160"/>
+        <w:t>This validation layer has its own limitations: the ground-truth PM2.5 series draws on only two of six Davao monitoring stations, covering specific station locations rather than the whole city; its 2020–2024 window overlaps the main panel’s 2013–2022 window in only three years (2020–2022); Station 07/17’s possible site relocation (not used in the PM2.5 comparison, which relies only on Stations 15 and 16) limits confidence in any trend drawn from that station specifically; and with only five years of satellite-ground pairs (three for the version check), all correlations and mean differences reported here are descriptive, not statistically robust estimates.</w:t>
+      </w:r>
+    </w:p>
+    <w:p>
+      <w:pPr>
+        <w:spacing w:after="120" w:before="220"/>
       </w:pPr>
       <w:r>
         <w:rPr>
@@ -6899,16 +8396,12 @@
           <w:sz w:val="22"/>
           <w:szCs w:val="22"/>
         </w:rPr>
-        <w:t xml:space="preserve">Limitations Specific to This Validation Layer</w:t>
-      </w:r>
-    </w:p>
-    <w:p>
-      <w:pPr>
-        <w:numPr>
-          <w:ilvl w:val="0"/>
-          <w:numId w:val="1"/>
-        </w:numPr>
-        <w:spacing w:after="120" w:line="276"/>
+        <w:t xml:space="preserve">Limitations</w:t>
+      </w:r>
+    </w:p>
+    <w:p>
+      <w:pPr>
+        <w:spacing w:after="160" w:line="360"/>
         <w:jc w:val="both"/>
       </w:pPr>
       <w:r>
@@ -6921,108 +8414,7 @@
           <w:sz w:val="22"/>
           <w:szCs w:val="22"/>
         </w:rPr>
-        <w:t xml:space="preserve">The ground-truth PM2.5 series draws on only two of six Davao monitoring stations, covering specific station locations rather than the whole city.</w:t>
-      </w:r>
-    </w:p>
-    <w:p>
-      <w:pPr>
-        <w:numPr>
-          <w:ilvl w:val="0"/>
-          <w:numId w:val="1"/>
-        </w:numPr>
-        <w:spacing w:after="120" w:line="276"/>
-        <w:jc w:val="both"/>
-      </w:pPr>
-      <w:r>
-        <w:rPr>
-          <w:rFonts w:ascii="Times New Roman" w:cs="Times New Roman" w:eastAsia="Times New Roman" w:hAnsi="Times New Roman"/>
-          <w:b w:val="false"/>
-          <w:bCs w:val="false"/>
-          <w:i w:val="false"/>
-          <w:iCs w:val="false"/>
-          <w:sz w:val="22"/>
-          <w:szCs w:val="22"/>
-        </w:rPr>
-        <w:t xml:space="preserve">The Davao ground-station window (2020–2024) does not overlap with most of the main panel’s window (2013–2022); only 2020–2022 overlap.</w:t>
-      </w:r>
-    </w:p>
-    <w:p>
-      <w:pPr>
-        <w:numPr>
-          <w:ilvl w:val="0"/>
-          <w:numId w:val="1"/>
-        </w:numPr>
-        <w:spacing w:after="120" w:line="276"/>
-        <w:jc w:val="both"/>
-      </w:pPr>
-      <w:r>
-        <w:rPr>
-          <w:rFonts w:ascii="Times New Roman" w:cs="Times New Roman" w:eastAsia="Times New Roman" w:hAnsi="Times New Roman"/>
-          <w:b w:val="false"/>
-          <w:bCs w:val="false"/>
-          <w:i w:val="false"/>
-          <w:iCs w:val="false"/>
-          <w:sz w:val="22"/>
-          <w:szCs w:val="22"/>
-        </w:rPr>
-        <w:t xml:space="preserve">Station 07/17’s possible site relocation limits confidence in any trend drawn from that station specifically (not used in the PM2.5 comparison above, which relies only on Stations 15 and 16).</w:t>
-      </w:r>
-    </w:p>
-    <w:p>
-      <w:pPr>
-        <w:numPr>
-          <w:ilvl w:val="0"/>
-          <w:numId w:val="1"/>
-        </w:numPr>
-        <w:spacing w:after="120" w:line="276"/>
-        <w:jc w:val="both"/>
-      </w:pPr>
-      <w:r>
-        <w:rPr>
-          <w:rFonts w:ascii="Times New Roman" w:cs="Times New Roman" w:eastAsia="Times New Roman" w:hAnsi="Times New Roman"/>
-          <w:b w:val="false"/>
-          <w:bCs w:val="false"/>
-          <w:i w:val="false"/>
-          <w:iCs w:val="false"/>
-          <w:sz w:val="22"/>
-          <w:szCs w:val="22"/>
-        </w:rPr>
-        <w:t xml:space="preserve">With five years of satellite-ground pairs (and three years for the version check), all correlations and mean differences reported here are descriptive and should not be interpreted as statistically robust estimates.</w:t>
-      </w:r>
-    </w:p>
-    <w:p>
-      <w:pPr>
-        <w:spacing w:after="120" w:before="220"/>
-      </w:pPr>
-      <w:r>
-        <w:rPr>
-          <w:rFonts w:ascii="Times New Roman" w:cs="Times New Roman" w:eastAsia="Times New Roman" w:hAnsi="Times New Roman"/>
-          <w:b/>
-          <w:bCs/>
-          <w:i w:val="false"/>
-          <w:iCs w:val="false"/>
-          <w:sz w:val="22"/>
-          <w:szCs w:val="22"/>
-        </w:rPr>
-        <w:t xml:space="preserve">Limitations</w:t>
-      </w:r>
-    </w:p>
-    <w:p>
-      <w:pPr>
-        <w:spacing w:after="160" w:line="276"/>
-        <w:jc w:val="both"/>
-      </w:pPr>
-      <w:r>
-        <w:rPr>
-          <w:rFonts w:ascii="Times New Roman" w:cs="Times New Roman" w:eastAsia="Times New Roman" w:hAnsi="Times New Roman"/>
-          <w:b w:val="false"/>
-          <w:bCs w:val="false"/>
-          <w:i w:val="false"/>
-          <w:iCs w:val="false"/>
-          <w:sz w:val="22"/>
-          <w:szCs w:val="22"/>
-        </w:rPr>
-        <w:t>Several limitations must be acknowledged. This is an ecological study: regional-level associations cannot be attributed to individuals (Robinson, 1950), and correlation does not establish causation. Province-to-region aggregation used simple means rather than population-weighted estimates, which may introduce aggregation bias; a population-weighted aggregation was considered for this manuscript but not implemented, because the only population dataset available in this repository covers just 12 of the Philippines’ approximately 81 provinces and only through 2020 (missing two of this study’s ten years), and was judged insufficient to redo the aggregation credibly for the full panel (see Ivy, Mulholland &amp; Russell, 2008, for standard population-weighted exposure-metric methodology, which was not applied here). ACAG satellite PM2.5 estimates carry inherent uncertainty in tropical coastal environments. No confounders beyond region and year effects were included; residual confounding from healthcare access, smoking, and socioeconomic factors may remain. The study period includes COVID-19 pandemic years (2020–2021), which disrupted healthcare utilization and likely affected formal diagnosis rates. Finally, GBD subnational asthma estimates are partly modeled and smoothed toward national trends, which reduces within-region variance and may understate real year-to-year fluctuations in asthma burden. In addition, a minimum-detectable-effect calculation (see Results) indicates this design could reliably detect true effects only down to roughly 90% of the magnitude actually observed at conventional 80% power — a concrete bound on, rather than merely a qualitative caveat about, the study’s statistical power.</w:t>
+        <w:t>Several limitations must be acknowledged. This is an ecological study: regional-level associations cannot be attributed to individuals (Robinson, 1950), and correlation does not establish causation. Province-to-region aggregation used simple means rather than population-weighted estimates, which may introduce aggregation bias; a population-weighted approach (Ivy, Mulholland &amp; Russell, 2008) was considered but not implemented, since the only available population dataset covers just 12 of the Philippines’ ~81 provinces, and only through 2020. ACAG satellite PM2.5 estimates carry inherent uncertainty in tropical coastal environments. No confounders beyond region and year effects were included; residual confounding from healthcare access, smoking, and socioeconomic factors may remain. Indoor biomass-fuel use, a proxy for regional urbanization, was tested directly (see Discussion above) and showed a modest association not robust to a single region (NCR), so this limitation is only partially addressed. The study period includes the COVID-19 pandemic years (2020–2021), which disrupted healthcare utilization and likely affected formal diagnosis rates. GBD subnational asthma estimates are partly modeled and smoothed toward national trends, reducing within-region variance and potentially understating real year-to-year fluctuations. A minimum-detectable-effect calculation (see Results) indicates this design could reliably detect true effects only down to roughly 90% of the observed magnitude at conventional 80% power — a concrete bound on, not just a qualitative caveat about, the study’s statistical power.</w:t>
       </w:r>
     </w:p>
     <w:p>
@@ -7044,7 +8436,7 @@
     </w:p>
     <w:p>
       <w:pPr>
-        <w:spacing w:after="160" w:line="276"/>
+        <w:spacing w:after="160" w:line="360"/>
         <w:jc w:val="both"/>
       </w:pPr>
       <w:r>
@@ -7057,12 +8449,12 @@
           <w:sz w:val="22"/>
           <w:szCs w:val="22"/>
         </w:rPr>
-        <w:t xml:space="preserve">This subnational ecological panel analysis of 17 Philippine regions over 2013–2022 found that the strong pooled cross-sectional correlation between satellite-derived PM2.5 and GBD-modeled pediatric asthma prevalence (r = +0.887) is driven primarily by between-region structural differences — urbanization, healthcare infrastructure, and diagnostic capacity co-occurring with pollution in the same regions — rather than within-region temporal variation in pollution exposure. After adjusting for region and year fixed effects, no robust association was identified, consistent with asthma prevalence being a near-static outcome with only 1.5% within-region variance in these data.</w:t>
-      </w:r>
-    </w:p>
-    <w:p>
-      <w:pPr>
-        <w:spacing w:after="160" w:line="276"/>
+        <w:t>This subnational ecological panel analysis of 17 Philippine regions over 2013–2022 found that the strong pooled cross-sectional correlation between satellite-derived PM2.5 and GBD-modeled pediatric asthma prevalence (r = +0.887) is driven primarily by between-region structural differences — urbanization, healthcare infrastructure, and diagnostic capacity co-occurring with pollution in the same regions — rather than within-region temporal variation in pollution exposure. After adjusting for region and year fixed effects, no robust association was identified, consistent with asthma prevalence being a near-static outcome with only 1.5% within-region variance in these data. This null/negative finding proved directionally stable but only narrowly robust: allowing each region its own secular trend, in addition to its own fixed level, shrank the coefficient by 63% and left it only narrowly significant, indicating that a meaningful share of the primary result may reflect differential regional trajectories rather than a shared within-region mechanism.</w:t>
+      </w:r>
+    </w:p>
+    <w:p>
+      <w:pPr>
+        <w:spacing w:after="160" w:line="360"/>
         <w:jc w:val="both"/>
       </w:pPr>
       <w:r>
@@ -7080,7 +8472,7 @@
     </w:p>
     <w:p>
       <w:pPr>
-        <w:spacing w:after="160" w:line="276"/>
+        <w:spacing w:after="160" w:line="360"/>
         <w:jc w:val="both"/>
       </w:pPr>
       <w:r>
@@ -7115,7 +8507,7 @@
     </w:p>
     <w:p>
       <w:pPr>
-        <w:spacing w:after="140" w:line="264"/>
+        <w:spacing w:after="140" w:line="360"/>
         <w:ind w:left="431" w:hanging="431"/>
         <w:jc w:val="both"/>
       </w:pPr>
@@ -7129,12 +8521,12 @@
           <w:sz w:val="20"/>
           <w:szCs w:val="20"/>
         </w:rPr>
-        <w:t xml:space="preserve">1. Ho CWL, Fernandez CJ, Roa CC Jr, et al. Epidemiology of pediatric asthma in the Philippines. The Lancet Regional Health – Western Pacific. 2023. doi:10.1016/j.lanwpc.2023.100806</w:t>
-      </w:r>
-    </w:p>
-    <w:p>
-      <w:pPr>
-        <w:spacing w:after="140" w:line="264"/>
+        <w:t>1. Legaspi KEY, Dychiao RGK, Dee EC, Kho-Dychiao RM, Ho FDV. Pediatric asthma in the Philippines: risk factors, barriers, and steps forward across the child's life stages. The Lancet Regional Health – Western Pacific. 2023. doi:10.1016/j.lanwpc.2023.100806</w:t>
+      </w:r>
+    </w:p>
+    <w:p>
+      <w:pPr>
+        <w:spacing w:after="140" w:line="360"/>
         <w:ind w:left="431" w:hanging="431"/>
         <w:jc w:val="both"/>
       </w:pPr>
@@ -7148,12 +8540,12 @@
           <w:sz w:val="20"/>
           <w:szCs w:val="20"/>
         </w:rPr>
-        <w:t xml:space="preserve">2. Yang IV, Lozano-Garcia M, Avila-Tang E, et al. Asthma trends in the Western Pacific region, 1990–2045. JMIR Public Health and Surveillance. 2024. doi:10.2196/55327</w:t>
-      </w:r>
-    </w:p>
-    <w:p>
-      <w:pPr>
-        <w:spacing w:after="140" w:line="264"/>
+        <w:t>2. Yang CH, Li XY, Lv JJ, Hou MJ, Zhang RH, Guo H, Feng C. Temporal Trends of Asthma Among Children in the Western Pacific Region From 1990 to 2045: Longitudinal Observational Study. JMIR Public Health and Surveillance. 2024;10:e55327. doi:10.2196/55327</w:t>
+      </w:r>
+    </w:p>
+    <w:p>
+      <w:pPr>
+        <w:spacing w:after="140" w:line="360"/>
         <w:ind w:left="431" w:hanging="431"/>
         <w:jc w:val="both"/>
       </w:pPr>
@@ -7167,12 +8559,12 @@
           <w:sz w:val="20"/>
           <w:szCs w:val="20"/>
         </w:rPr>
-        <w:t xml:space="preserve">3. Gallano JM, et al. PM2.5 and child respiratory illness in the Philippines. Asian Environmental Research. 2024. Available at: https://ph01.tci-thaijo.org/index.php/aer/article/view/255626</w:t>
-      </w:r>
-    </w:p>
-    <w:p>
-      <w:pPr>
-        <w:spacing w:after="140" w:line="264"/>
+        <w:t>3. Ceballos RF, Gallano RC, Visaya LD. Assessing the Relationship and Effect of Air Pollution [PM2.5] on Child Respiratory Illness and Child Mortality in the Philippines. Applied Environmental Research. 2024. Available at: https://ph01.tci-thaijo.org/index.php/aer/article/view/255626</w:t>
+      </w:r>
+    </w:p>
+    <w:p>
+      <w:pPr>
+        <w:spacing w:after="140" w:line="360"/>
         <w:ind w:left="431" w:hanging="431"/>
         <w:jc w:val="both"/>
       </w:pPr>
@@ -7186,12 +8578,12 @@
           <w:sz w:val="20"/>
           <w:szCs w:val="20"/>
         </w:rPr>
-        <w:t xml:space="preserve">4. Zhang H, et al. Particulate matter and pediatric asthma exacerbation: a systematic review and meta-analysis. 2021. PMC8312457.</w:t>
-      </w:r>
-    </w:p>
-    <w:p>
-      <w:pPr>
-        <w:spacing w:after="140" w:line="264"/>
+        <w:t>4. Yang X, Zhang Y, Zhan X, Xu X, Li S, Xu X, Ying S, Chen Z. Particulate matter exposure is highly correlated to pediatric asthma exacerbation. Aging. 2021. doi:10.18632/aging.203281. PMC8312457.</w:t>
+      </w:r>
+    </w:p>
+    <w:p>
+      <w:pPr>
+        <w:spacing w:after="140" w:line="360"/>
         <w:ind w:left="431" w:hanging="431"/>
         <w:jc w:val="both"/>
       </w:pPr>
@@ -7205,12 +8597,12 @@
           <w:sz w:val="20"/>
           <w:szCs w:val="20"/>
         </w:rPr>
-        <w:t xml:space="preserve">5. Ye X, et al. PM10 and pediatric respiratory hospitalization: evidence from multi-city time-series studies. 2023. PMC9908005.</w:t>
-      </w:r>
-    </w:p>
-    <w:p>
-      <w:pPr>
-        <w:spacing w:after="140" w:line="264"/>
+        <w:t>5. Zhou X, Guo M, Li Z, Yu X, Huang G, Li Z, Zhang X, Liu L. Associations between air pollutant and pneumonia and asthma requiring hospitalization among children aged under 5 years in Ningbo, 2015–2017. Frontiers in Public Health. 2022. PMC9908005.</w:t>
+      </w:r>
+    </w:p>
+    <w:p>
+      <w:pPr>
+        <w:spacing w:after="140" w:line="360"/>
         <w:ind w:left="431" w:hanging="431"/>
         <w:jc w:val="both"/>
       </w:pPr>
@@ -7229,7 +8621,7 @@
     </w:p>
     <w:p>
       <w:pPr>
-        <w:spacing w:after="140" w:line="264"/>
+        <w:spacing w:after="140" w:line="360"/>
         <w:ind w:left="431" w:hanging="431"/>
         <w:jc w:val="both"/>
       </w:pPr>
@@ -7248,7 +8640,7 @@
     </w:p>
     <w:p>
       <w:pPr>
-        <w:spacing w:after="140" w:line="264"/>
+        <w:spacing w:after="140" w:line="360"/>
         <w:ind w:left="431" w:hanging="431"/>
         <w:jc w:val="both"/>
       </w:pPr>
@@ -7427,7 +8819,7 @@
           <w:b w:val="0"/>
           <w:sz w:val="22"/>
         </w:rPr>
-        <w:t>19. Greenland S, Pearl J, Robins JM. Causal diagrams for epidemiologic research. Epidemiology. 1999;10(1):37-48. doi:10.1097/00001648-199901000-00008</w:t>
+        <w:t>19. Moran PAP. Notes on continuous stochastic phenomena. Biometrika. 1950;37(1-2):17-23. doi:10.1093/biomet/37.1-2.17</w:t>
       </w:r>
     </w:p>
     <w:p>
@@ -7442,7 +8834,7 @@
           <w:b w:val="0"/>
           <w:sz w:val="22"/>
         </w:rPr>
-        <w:t>20. Textor J, van der Zander B, Gilthorpe MS, Liśkiewicz M, Ellison GTH. Robust causal inference using directed acyclic graphs: the R package 'dagitty'. International Journal of Epidemiology. 2016;45(6):1887-1894. doi:10.1093/ije/dyw341</w:t>
+        <w:t>20. Anselin L. Local indicators of spatial association—LISA. Geographical Analysis. 1995;27(2):93-115. doi:10.1111/j.1538-4632.1995.tb00338.x</w:t>
       </w:r>
     </w:p>
     <w:p>
@@ -7457,37 +8849,94 @@
           <w:b w:val="0"/>
           <w:sz w:val="22"/>
         </w:rPr>
-        <w:t>21. Moran PAP. Notes on continuous stochastic phenomena. Biometrika. 1950;37(1-2):17-23. doi:10.1093/biomet/37.1-2.17</w:t>
+        <w:t>21. Robinson WS. Ecological correlations and the behavior of individuals. American Sociological Review. 1950;15(3):351-357. doi:10.2307/2087176</w:t>
       </w:r>
     </w:p>
     <w:p>
       <w:pPr>
         <w:spacing w:after="140"/>
         <w:ind w:left="431" w:hanging="431"/>
-        <w:jc w:val="both"/>
       </w:pPr>
       <w:r>
         <w:rPr>
           <w:rFonts w:ascii="Times New Roman" w:hAnsi="Times New Roman"/>
           <w:b w:val="0"/>
-          <w:sz w:val="22"/>
-        </w:rPr>
-        <w:t>22. Anselin L. Local indicators of spatial association—LISA. Geographical Analysis. 1995;27(2):93-115. doi:10.1111/j.1538-4632.1995.tb00338.x</w:t>
+          <w:i w:val="0"/>
+          <w:sz w:val="22"/>
+        </w:rPr>
+        <w:t>22. Holm S. A simple sequentially rejective multiple test procedure. Scandinavian Journal of Statistics. 1979;6(2):65-70. doi:10.2307/4615733</w:t>
       </w:r>
     </w:p>
     <w:p>
       <w:pPr>
         <w:spacing w:after="140"/>
         <w:ind w:left="431" w:hanging="431"/>
-        <w:jc w:val="both"/>
       </w:pPr>
       <w:r>
         <w:rPr>
           <w:rFonts w:ascii="Times New Roman" w:hAnsi="Times New Roman"/>
           <w:b w:val="0"/>
-          <w:sz w:val="22"/>
-        </w:rPr>
-        <w:t>23. Robinson WS. Ecological correlations and the behavior of individuals. American Sociological Review. 1950;15(3):351-357. doi:10.2307/2087176</w:t>
+          <w:i w:val="0"/>
+          <w:sz w:val="22"/>
+        </w:rPr>
+        <w:t>23. Philippine Statistics Authority (PSA) and ICF. Philippines National Demographic and Health Survey 2013. Manila, Philippines, and Rockville, Maryland, USA: PSA and ICF; 2014.</w:t>
+      </w:r>
+    </w:p>
+    <w:p>
+      <w:pPr>
+        <w:spacing w:after="140"/>
+        <w:ind w:left="431" w:hanging="431"/>
+      </w:pPr>
+      <w:r>
+        <w:rPr>
+          <w:rFonts w:ascii="Times New Roman" w:hAnsi="Times New Roman"/>
+          <w:b w:val="0"/>
+          <w:i w:val="0"/>
+          <w:sz w:val="22"/>
+        </w:rPr>
+        <w:t>24. Wang W, Assaf S, Mayala B, Moonzwe Davis L. Household Air Pollution: National and Subnational Estimates in Bangladesh, India, Indonesia, Nepal, and the Philippines. DHS Working Paper No. 164. Rockville, Maryland, USA: ICF; 2020.</w:t>
+      </w:r>
+    </w:p>
+    <w:p>
+      <w:pPr>
+        <w:spacing w:after="140"/>
+        <w:ind w:left="431" w:hanging="431"/>
+      </w:pPr>
+      <w:r>
+        <w:rPr>
+          <w:rFonts w:ascii="Times New Roman" w:hAnsi="Times New Roman"/>
+          <w:b w:val="0"/>
+          <w:i w:val="0"/>
+          <w:sz w:val="22"/>
+        </w:rPr>
+        <w:t>25. Philippine Statistics Authority (PSA) and ICF. 2022 Philippines National Demographic and Health Survey (NDHS) Final Report. Quezon City, Philippines, and Rockville, Maryland, USA: PSA and ICF; 2023.</w:t>
+      </w:r>
+    </w:p>
+    <w:p>
+      <w:pPr>
+        <w:spacing w:after="140"/>
+        <w:ind w:left="431" w:hanging="431"/>
+      </w:pPr>
+      <w:r>
+        <w:rPr>
+          <w:rFonts w:ascii="Times New Roman" w:hAnsi="Times New Roman"/>
+          <w:b w:val="0"/>
+          <w:i w:val="0"/>
+          <w:sz w:val="22"/>
+        </w:rPr>
+        <w:t>26. Wolfers J. Did unilateral divorce laws raise divorce rates? A reconciliation and new results. American Economic Review. 2006;96(5):1802-1820. doi:10.1257/aer.96.5.1802</w:t>
+      </w:r>
+    </w:p>
+    <w:p>
+      <w:pPr>
+        <w:spacing w:after="140"/>
+      </w:pPr>
+      <w:r>
+        <w:rPr>
+          <w:rFonts w:ascii="Times New Roman" w:hAnsi="Times New Roman"/>
+          <w:sz w:val="22"/>
+        </w:rPr>
+        <w:t>27. Simonsohn U, Simmons JP, Nelson LD. Specification curve analysis. Nature Human Behaviour. 2020;4:1208-1214. doi:10.1038/s41562-020-0912-z</w:t>
       </w:r>
     </w:p>
     <w:p>
@@ -7509,7 +8958,7 @@
     </w:p>
     <w:p>
       <w:pPr>
-        <w:spacing w:after="160" w:line="276"/>
+        <w:spacing w:after="160" w:line="360"/>
         <w:jc w:val="both"/>
       </w:pPr>
       <w:r>
@@ -7833,7 +9282,11 @@
         <w:szCs w:val="22"/>
       </w:rPr>
     </w:rPrDefault>
-    <w:pPrDefault/>
+    <w:pPrDefault>
+      <w:pPr>
+        <w:spacing w:line="360" w:lineRule="auto"/>
+      </w:pPr>
+    </w:pPrDefault>
   </w:docDefaults>
   <w:style w:type="paragraph" w:styleId="Title">
     <w:name w:val="Title"/>

</xml_diff>